<commit_message>
feat(em): include Table 1 and Table 2 in unified plain classic Word table document
</commit_message>
<xml_diff>
--- a/EM_table_OOS-261187_11MAY2026.docx
+++ b/EM_table_OOS-261187_11MAY2026.docx
@@ -2,6 +2,477 @@
 <file path=word/document.xml><?xml version="1.0" encoding="utf-8"?>
 <w:document xmlns:wpc="http://schemas.microsoft.com/office/word/2010/wordprocessingCanvas" xmlns:mo="http://schemas.microsoft.com/office/mac/office/2008/main" xmlns:mc="http://schemas.openxmlformats.org/markup-compatibility/2006" xmlns:mv="urn:schemas-microsoft-com:mac:vml" xmlns:o="urn:schemas-microsoft-com:office:office" xmlns:r="http://schemas.openxmlformats.org/officeDocument/2006/relationships" xmlns:m="http://schemas.openxmlformats.org/officeDocument/2006/math" xmlns:v="urn:schemas-microsoft-com:vml" xmlns:wp14="http://schemas.microsoft.com/office/word/2010/wordprocessingDrawing" xmlns:wp="http://schemas.openxmlformats.org/drawingml/2006/wordprocessingDrawing" xmlns:w10="urn:schemas-microsoft-com:office:word" xmlns:w="http://schemas.openxmlformats.org/wordprocessingml/2006/main" xmlns:w14="http://schemas.microsoft.com/office/word/2010/wordml" xmlns:wpg="http://schemas.microsoft.com/office/word/2010/wordprocessingGroup" xmlns:wpi="http://schemas.microsoft.com/office/word/2010/wordprocessingInk" xmlns:wne="http://schemas.microsoft.com/office/word/2006/wordml" xmlns:wps="http://schemas.microsoft.com/office/word/2010/wordprocessingShape" mc:Ignorable="w14 wp14">
   <w:body>
+    <w:tbl>
+      <w:tblPr>
+        <w:tblW w:type="auto" w:w="0"/>
+        <w:jc w:val="left"/>
+        <w:tblLayout w:type="fixed"/>
+        <w:tblLook w:firstColumn="1" w:firstRow="1" w:lastColumn="0" w:lastRow="0" w:noHBand="0" w:noVBand="1" w:val="04A0"/>
+      </w:tblPr>
+      <w:tblGrid>
+        <w:gridCol w:w="1170"/>
+        <w:gridCol w:w="1170"/>
+        <w:gridCol w:w="1170"/>
+        <w:gridCol w:w="1170"/>
+        <w:gridCol w:w="1170"/>
+        <w:gridCol w:w="1170"/>
+        <w:gridCol w:w="1170"/>
+        <w:gridCol w:w="1170"/>
+      </w:tblGrid>
+      <w:tr>
+        <w:tc>
+          <w:tcPr>
+            <w:tcW w:type="dxa" w:w="2160"/>
+            <w:shd w:fill="E8E8E8"/>
+            <w:tcBorders>
+              <w:top w:val="single" w:sz="4" w:space="0" w:color="auto"/>
+              <w:bottom w:val="single" w:sz="4" w:space="0" w:color="auto"/>
+              <w:left w:val="single" w:sz="4" w:space="0" w:color="auto"/>
+              <w:right w:val="single" w:sz="4" w:space="0" w:color="auto"/>
+            </w:tcBorders>
+          </w:tcPr>
+          <w:p>
+            <w:pPr>
+              <w:spacing w:before="0" w:after="0"/>
+              <w:jc w:val="left"/>
+            </w:pPr>
+            <w:r>
+              <w:rPr>
+                <w:rFonts w:ascii="Times New Roman" w:hAnsi="Times New Roman"/>
+                <w:b/>
+                <w:color w:val="000000"/>
+                <w:sz w:val="12"/>
+              </w:rPr>
+              <w:t>Sampling Location</w:t>
+            </w:r>
+          </w:p>
+        </w:tc>
+        <w:tc>
+          <w:tcPr>
+            <w:tcW w:type="dxa" w:w="1008"/>
+            <w:shd w:fill="E8E8E8"/>
+            <w:tcBorders>
+              <w:top w:val="single" w:sz="4" w:space="0" w:color="auto"/>
+              <w:bottom w:val="single" w:sz="4" w:space="0" w:color="auto"/>
+              <w:left w:val="single" w:sz="4" w:space="0" w:color="auto"/>
+              <w:right w:val="single" w:sz="4" w:space="0" w:color="auto"/>
+            </w:tcBorders>
+          </w:tcPr>
+          <w:p>
+            <w:pPr>
+              <w:spacing w:before="0" w:after="0"/>
+              <w:jc w:val="left"/>
+            </w:pPr>
+            <w:r>
+              <w:rPr>
+                <w:rFonts w:ascii="Times New Roman" w:hAnsi="Times New Roman"/>
+                <w:b/>
+                <w:color w:val="000000"/>
+                <w:sz w:val="12"/>
+              </w:rPr>
+              <w:t>Read Date</w:t>
+              <w:br/>
+              <w:t>(30-35°C, NLT 48h)</w:t>
+            </w:r>
+          </w:p>
+        </w:tc>
+        <w:tc>
+          <w:tcPr>
+            <w:tcW w:type="dxa" w:w="576"/>
+            <w:shd w:fill="E8E8E8"/>
+            <w:tcBorders>
+              <w:top w:val="single" w:sz="4" w:space="0" w:color="auto"/>
+              <w:bottom w:val="single" w:sz="4" w:space="0" w:color="auto"/>
+              <w:left w:val="single" w:sz="4" w:space="0" w:color="auto"/>
+              <w:right w:val="single" w:sz="4" w:space="0" w:color="auto"/>
+            </w:tcBorders>
+          </w:tcPr>
+          <w:p>
+            <w:pPr>
+              <w:spacing w:before="0" w:after="0"/>
+              <w:jc w:val="left"/>
+            </w:pPr>
+            <w:r>
+              <w:rPr>
+                <w:rFonts w:ascii="Times New Roman" w:hAnsi="Times New Roman"/>
+                <w:b/>
+                <w:color w:val="000000"/>
+                <w:sz w:val="12"/>
+              </w:rPr>
+              <w:t>Read</w:t>
+              <w:br/>
+              <w:t>By</w:t>
+            </w:r>
+          </w:p>
+        </w:tc>
+        <w:tc>
+          <w:tcPr>
+            <w:tcW w:type="dxa" w:w="1296"/>
+            <w:shd w:fill="E8E8E8"/>
+            <w:tcBorders>
+              <w:top w:val="single" w:sz="4" w:space="0" w:color="auto"/>
+              <w:bottom w:val="single" w:sz="4" w:space="0" w:color="auto"/>
+              <w:left w:val="single" w:sz="4" w:space="0" w:color="auto"/>
+              <w:right w:val="single" w:sz="4" w:space="0" w:color="auto"/>
+            </w:tcBorders>
+          </w:tcPr>
+          <w:p>
+            <w:pPr>
+              <w:spacing w:before="0" w:after="0"/>
+              <w:jc w:val="left"/>
+            </w:pPr>
+            <w:r>
+              <w:rPr>
+                <w:rFonts w:ascii="Times New Roman" w:hAnsi="Times New Roman"/>
+                <w:b/>
+                <w:color w:val="000000"/>
+                <w:sz w:val="12"/>
+              </w:rPr>
+              <w:t>CFU Count /</w:t>
+              <w:br/>
+              <w:t>Observation</w:t>
+            </w:r>
+          </w:p>
+        </w:tc>
+        <w:tc>
+          <w:tcPr>
+            <w:tcW w:type="dxa" w:w="1008"/>
+            <w:shd w:fill="E8E8E8"/>
+            <w:tcBorders>
+              <w:top w:val="single" w:sz="4" w:space="0" w:color="auto"/>
+              <w:bottom w:val="single" w:sz="4" w:space="0" w:color="auto"/>
+              <w:left w:val="single" w:sz="4" w:space="0" w:color="auto"/>
+              <w:right w:val="single" w:sz="4" w:space="0" w:color="auto"/>
+            </w:tcBorders>
+          </w:tcPr>
+          <w:p>
+            <w:pPr>
+              <w:spacing w:before="0" w:after="0"/>
+              <w:jc w:val="left"/>
+            </w:pPr>
+            <w:r>
+              <w:rPr>
+                <w:rFonts w:ascii="Times New Roman" w:hAnsi="Times New Roman"/>
+                <w:b/>
+                <w:color w:val="000000"/>
+                <w:sz w:val="12"/>
+              </w:rPr>
+              <w:t>Read Date</w:t>
+              <w:br/>
+              <w:t>(20-25°C, NLT 5d)</w:t>
+            </w:r>
+          </w:p>
+        </w:tc>
+        <w:tc>
+          <w:tcPr>
+            <w:tcW w:type="dxa" w:w="576"/>
+            <w:shd w:fill="E8E8E8"/>
+            <w:tcBorders>
+              <w:top w:val="single" w:sz="4" w:space="0" w:color="auto"/>
+              <w:bottom w:val="single" w:sz="4" w:space="0" w:color="auto"/>
+              <w:left w:val="single" w:sz="4" w:space="0" w:color="auto"/>
+              <w:right w:val="single" w:sz="4" w:space="0" w:color="auto"/>
+            </w:tcBorders>
+          </w:tcPr>
+          <w:p>
+            <w:pPr>
+              <w:spacing w:before="0" w:after="0"/>
+              <w:jc w:val="left"/>
+            </w:pPr>
+            <w:r>
+              <w:rPr>
+                <w:rFonts w:ascii="Times New Roman" w:hAnsi="Times New Roman"/>
+                <w:b/>
+                <w:color w:val="000000"/>
+                <w:sz w:val="12"/>
+              </w:rPr>
+              <w:t>Read</w:t>
+              <w:br/>
+              <w:t>By</w:t>
+            </w:r>
+          </w:p>
+        </w:tc>
+        <w:tc>
+          <w:tcPr>
+            <w:tcW w:type="dxa" w:w="1296"/>
+            <w:shd w:fill="E8E8E8"/>
+            <w:tcBorders>
+              <w:top w:val="single" w:sz="4" w:space="0" w:color="auto"/>
+              <w:bottom w:val="single" w:sz="4" w:space="0" w:color="auto"/>
+              <w:left w:val="single" w:sz="4" w:space="0" w:color="auto"/>
+              <w:right w:val="single" w:sz="4" w:space="0" w:color="auto"/>
+            </w:tcBorders>
+          </w:tcPr>
+          <w:p>
+            <w:pPr>
+              <w:spacing w:before="0" w:after="0"/>
+              <w:jc w:val="left"/>
+            </w:pPr>
+            <w:r>
+              <w:rPr>
+                <w:rFonts w:ascii="Times New Roman" w:hAnsi="Times New Roman"/>
+                <w:b/>
+                <w:color w:val="000000"/>
+                <w:sz w:val="12"/>
+              </w:rPr>
+              <w:t>CFU Count /</w:t>
+              <w:br/>
+              <w:t>Observation</w:t>
+            </w:r>
+          </w:p>
+        </w:tc>
+        <w:tc>
+          <w:tcPr>
+            <w:tcW w:type="dxa" w:w="1440"/>
+            <w:shd w:fill="E8E8E8"/>
+            <w:tcBorders>
+              <w:top w:val="single" w:sz="4" w:space="0" w:color="auto"/>
+              <w:bottom w:val="single" w:sz="4" w:space="0" w:color="auto"/>
+              <w:left w:val="single" w:sz="4" w:space="0" w:color="auto"/>
+              <w:right w:val="single" w:sz="4" w:space="0" w:color="auto"/>
+            </w:tcBorders>
+          </w:tcPr>
+          <w:p>
+            <w:pPr>
+              <w:spacing w:before="0" w:after="0"/>
+              <w:jc w:val="left"/>
+            </w:pPr>
+            <w:r>
+              <w:rPr>
+                <w:rFonts w:ascii="Times New Roman" w:hAnsi="Times New Roman"/>
+                <w:b/>
+                <w:color w:val="000000"/>
+                <w:sz w:val="12"/>
+              </w:rPr>
+              <w:t>Microbial Identification</w:t>
+            </w:r>
+          </w:p>
+        </w:tc>
+      </w:tr>
+      <w:tr>
+        <w:tc>
+          <w:tcPr>
+            <w:tcW w:type="dxa" w:w="2160"/>
+            <w:shd w:fill="FFFFFF"/>
+            <w:tcBorders>
+              <w:top w:val="single" w:sz="4" w:space="0" w:color="auto"/>
+              <w:bottom w:val="single" w:sz="4" w:space="0" w:color="auto"/>
+              <w:left w:val="single" w:sz="4" w:space="0" w:color="auto"/>
+              <w:right w:val="single" w:sz="4" w:space="0" w:color="auto"/>
+            </w:tcBorders>
+          </w:tcPr>
+          <w:p>
+            <w:pPr>
+              <w:spacing w:before="0" w:after="0"/>
+              <w:jc w:val="left"/>
+            </w:pPr>
+            <w:r>
+              <w:rPr>
+                <w:rFonts w:ascii="Times New Roman" w:hAnsi="Times New Roman"/>
+                <w:b w:val="0"/>
+                <w:color w:val="000000"/>
+                <w:sz w:val="14"/>
+              </w:rPr>
+              <w:t>Surface Sampling (Changeover) Plate (BSC E001309)</w:t>
+            </w:r>
+          </w:p>
+        </w:tc>
+        <w:tc>
+          <w:tcPr>
+            <w:tcW w:type="dxa" w:w="1008"/>
+            <w:shd w:fill="FFFFFF"/>
+            <w:tcBorders>
+              <w:top w:val="single" w:sz="4" w:space="0" w:color="auto"/>
+              <w:bottom w:val="single" w:sz="4" w:space="0" w:color="auto"/>
+              <w:left w:val="single" w:sz="4" w:space="0" w:color="auto"/>
+              <w:right w:val="single" w:sz="4" w:space="0" w:color="auto"/>
+            </w:tcBorders>
+          </w:tcPr>
+          <w:p>
+            <w:pPr>
+              <w:spacing w:before="0" w:after="0"/>
+              <w:jc w:val="left"/>
+            </w:pPr>
+            <w:r>
+              <w:rPr>
+                <w:rFonts w:ascii="Times New Roman" w:hAnsi="Times New Roman"/>
+                <w:b w:val="0"/>
+                <w:color w:val="000000"/>
+                <w:sz w:val="14"/>
+              </w:rPr>
+              <w:t>13 May 2026</w:t>
+            </w:r>
+          </w:p>
+        </w:tc>
+        <w:tc>
+          <w:tcPr>
+            <w:tcW w:type="dxa" w:w="576"/>
+            <w:shd w:fill="FFFFFF"/>
+            <w:tcBorders>
+              <w:top w:val="single" w:sz="4" w:space="0" w:color="auto"/>
+              <w:bottom w:val="single" w:sz="4" w:space="0" w:color="auto"/>
+              <w:left w:val="single" w:sz="4" w:space="0" w:color="auto"/>
+              <w:right w:val="single" w:sz="4" w:space="0" w:color="auto"/>
+            </w:tcBorders>
+          </w:tcPr>
+          <w:p>
+            <w:pPr>
+              <w:spacing w:before="0" w:after="0"/>
+              <w:jc w:val="left"/>
+            </w:pPr>
+            <w:r>
+              <w:rPr>
+                <w:rFonts w:ascii="Times New Roman" w:hAnsi="Times New Roman"/>
+                <w:b w:val="0"/>
+                <w:color w:val="000000"/>
+                <w:sz w:val="14"/>
+              </w:rPr>
+              <w:t>MC</w:t>
+            </w:r>
+          </w:p>
+        </w:tc>
+        <w:tc>
+          <w:tcPr>
+            <w:tcW w:type="dxa" w:w="1296"/>
+            <w:shd w:fill="FFFFFF"/>
+            <w:tcBorders>
+              <w:top w:val="single" w:sz="4" w:space="0" w:color="auto"/>
+              <w:bottom w:val="single" w:sz="4" w:space="0" w:color="auto"/>
+              <w:left w:val="single" w:sz="4" w:space="0" w:color="auto"/>
+              <w:right w:val="single" w:sz="4" w:space="0" w:color="auto"/>
+            </w:tcBorders>
+          </w:tcPr>
+          <w:p>
+            <w:pPr>
+              <w:spacing w:before="0" w:after="0"/>
+              <w:jc w:val="left"/>
+            </w:pPr>
+            <w:r>
+              <w:rPr>
+                <w:rFonts w:ascii="Times New Roman" w:hAnsi="Times New Roman"/>
+                <w:b w:val="0"/>
+                <w:color w:val="000000"/>
+                <w:sz w:val="14"/>
+              </w:rPr>
+              <w:t>No microbial growth was observed</w:t>
+            </w:r>
+          </w:p>
+        </w:tc>
+        <w:tc>
+          <w:tcPr>
+            <w:tcW w:type="dxa" w:w="1008"/>
+            <w:shd w:fill="FFFFFF"/>
+            <w:tcBorders>
+              <w:top w:val="single" w:sz="4" w:space="0" w:color="auto"/>
+              <w:bottom w:val="single" w:sz="4" w:space="0" w:color="auto"/>
+              <w:left w:val="single" w:sz="4" w:space="0" w:color="auto"/>
+              <w:right w:val="single" w:sz="4" w:space="0" w:color="auto"/>
+            </w:tcBorders>
+          </w:tcPr>
+          <w:p>
+            <w:pPr>
+              <w:spacing w:before="0" w:after="0"/>
+              <w:jc w:val="left"/>
+            </w:pPr>
+            <w:r>
+              <w:rPr>
+                <w:rFonts w:ascii="Times New Roman" w:hAnsi="Times New Roman"/>
+                <w:b w:val="0"/>
+                <w:color w:val="000000"/>
+                <w:sz w:val="14"/>
+              </w:rPr>
+              <w:t>18 May 2026</w:t>
+            </w:r>
+          </w:p>
+        </w:tc>
+        <w:tc>
+          <w:tcPr>
+            <w:tcW w:type="dxa" w:w="576"/>
+            <w:shd w:fill="FFFFFF"/>
+            <w:tcBorders>
+              <w:top w:val="single" w:sz="4" w:space="0" w:color="auto"/>
+              <w:bottom w:val="single" w:sz="4" w:space="0" w:color="auto"/>
+              <w:left w:val="single" w:sz="4" w:space="0" w:color="auto"/>
+              <w:right w:val="single" w:sz="4" w:space="0" w:color="auto"/>
+            </w:tcBorders>
+          </w:tcPr>
+          <w:p>
+            <w:pPr>
+              <w:spacing w:before="0" w:after="0"/>
+              <w:jc w:val="left"/>
+            </w:pPr>
+            <w:r>
+              <w:rPr>
+                <w:rFonts w:ascii="Times New Roman" w:hAnsi="Times New Roman"/>
+                <w:b w:val="0"/>
+                <w:color w:val="000000"/>
+                <w:sz w:val="14"/>
+              </w:rPr>
+              <w:t>SAS</w:t>
+            </w:r>
+          </w:p>
+        </w:tc>
+        <w:tc>
+          <w:tcPr>
+            <w:tcW w:type="dxa" w:w="1296"/>
+            <w:shd w:fill="FFFFFF"/>
+            <w:tcBorders>
+              <w:top w:val="single" w:sz="4" w:space="0" w:color="auto"/>
+              <w:bottom w:val="single" w:sz="4" w:space="0" w:color="auto"/>
+              <w:left w:val="single" w:sz="4" w:space="0" w:color="auto"/>
+              <w:right w:val="single" w:sz="4" w:space="0" w:color="auto"/>
+            </w:tcBorders>
+          </w:tcPr>
+          <w:p>
+            <w:pPr>
+              <w:spacing w:before="0" w:after="0"/>
+              <w:jc w:val="left"/>
+            </w:pPr>
+            <w:r>
+              <w:rPr>
+                <w:rFonts w:ascii="Times New Roman" w:hAnsi="Times New Roman"/>
+                <w:b w:val="0"/>
+                <w:color w:val="000000"/>
+                <w:sz w:val="14"/>
+              </w:rPr>
+              <w:t>1 CFU on ScanC/O CGS E001309 S1 11MAY2026</w:t>
+            </w:r>
+          </w:p>
+        </w:tc>
+        <w:tc>
+          <w:tcPr>
+            <w:tcW w:type="dxa" w:w="1440"/>
+            <w:shd w:fill="FFFFFF"/>
+            <w:tcBorders>
+              <w:top w:val="single" w:sz="4" w:space="0" w:color="auto"/>
+              <w:bottom w:val="single" w:sz="4" w:space="0" w:color="auto"/>
+              <w:left w:val="single" w:sz="4" w:space="0" w:color="auto"/>
+              <w:right w:val="single" w:sz="4" w:space="0" w:color="auto"/>
+            </w:tcBorders>
+          </w:tcPr>
+          <w:p>
+            <w:pPr>
+              <w:spacing w:before="0" w:after="0"/>
+              <w:jc w:val="left"/>
+            </w:pPr>
+            <w:r>
+              <w:rPr>
+                <w:rFonts w:ascii="Times New Roman" w:hAnsi="Times New Roman"/>
+                <w:b w:val="0"/>
+                <w:color w:val="000000"/>
+                <w:sz w:val="14"/>
+              </w:rPr>
+              <w:t>White, shiny, hardened, smooth area embeded on agar</w:t>
+            </w:r>
+          </w:p>
+        </w:tc>
+      </w:tr>
+    </w:tbl>
+    <w:p>
+      <w:pPr>
+        <w:spacing w:before="120" w:after="120"/>
+      </w:pPr>
+    </w:p>
     <w:tbl>
       <w:tblPr>
         <w:tblW w:type="auto" w:w="0"/>
@@ -1088,9 +1559,7 @@
                 <w:color w:val="000000"/>
                 <w:sz w:val="14"/>
               </w:rPr>
-              <w:t>Surface Sampling of ISO 5</w:t>
-              <w:br/>
-              <w:t>(4 locations)</w:t>
+              <w:t>Surface Sampling of ISO 5 (4 locations)</w:t>
             </w:r>
           </w:p>
         </w:tc>
@@ -1416,9 +1885,7 @@
                 <w:color w:val="000000"/>
                 <w:sz w:val="14"/>
               </w:rPr>
-              <w:t>CGS, DT,</w:t>
-              <w:br/>
-              <w:t>GA, VV</w:t>
+              <w:t xml:space="preserve">CGS, DT, GA, VV </w:t>
             </w:r>
           </w:p>
         </w:tc>
@@ -1582,9 +2049,7 @@
                 <w:color w:val="000000"/>
                 <w:sz w:val="14"/>
               </w:rPr>
-              <w:t>Surface Sampling of ISO 5</w:t>
-              <w:br/>
-              <w:t>(4 locations)</w:t>
+              <w:t>Surface Sampling of ISO 5 (4 locations)</w:t>
             </w:r>
           </w:p>
         </w:tc>
@@ -1829,9 +2294,7 @@
                 <w:color w:val="000000"/>
                 <w:sz w:val="14"/>
               </w:rPr>
-              <w:t>Settling Sampling of ISO 5</w:t>
-              <w:br/>
-              <w:t>(2 locations)</w:t>
+              <w:t>Settling Sampling of ISO 5 (2 locations)</w:t>
             </w:r>
           </w:p>
         </w:tc>
@@ -2076,9 +2539,7 @@
                 <w:color w:val="000000"/>
                 <w:sz w:val="14"/>
               </w:rPr>
-              <w:t>Settling Sampling of ISO 5</w:t>
-              <w:br/>
-              <w:t>(2 locations)</w:t>
+              <w:t>Settling Sampling of ISO 5 (2 locations)</w:t>
             </w:r>
           </w:p>
         </w:tc>
@@ -2159,7 +2620,7 @@
                 <w:color w:val="000000"/>
                 <w:sz w:val="14"/>
               </w:rPr>
-              <w:t>CGS, DT, GA, VV</w:t>
+              <w:t xml:space="preserve">CGS, DT, GA, VV </w:t>
             </w:r>
           </w:p>
         </w:tc>
@@ -2323,9 +2784,7 @@
                 <w:color w:val="000000"/>
                 <w:sz w:val="14"/>
               </w:rPr>
-              <w:t>Settling Sampling of ISO 5</w:t>
-              <w:br/>
-              <w:t>(2 locations)</w:t>
+              <w:t>Settling Sampling of ISO 5 (2 locations)</w:t>
             </w:r>
           </w:p>
         </w:tc>
@@ -3034,7 +3493,9 @@
                 <w:color w:val="000000"/>
                 <w:sz w:val="14"/>
               </w:rPr>
-              <w:t>Gram (+) cocci  Gram (+) pleomorphic rods</w:t>
+              <w:t>Gram (+) cocci</w:t>
+              <w:br/>
+              <w:t xml:space="preserve"> Gram (+) pleomorphic rods</w:t>
             </w:r>
           </w:p>
         </w:tc>

</xml_diff>

<commit_message>
feat(em): add exact underlined Table 1 and Table 2 titles and screenshot-accurate columns
</commit_message>
<xml_diff>
--- a/EM_table_OOS-261187_11MAY2026.docx
+++ b/EM_table_OOS-261187_11MAY2026.docx
@@ -2,6 +2,20 @@
 <file path=word/document.xml><?xml version="1.0" encoding="utf-8"?>
 <w:document xmlns:wpc="http://schemas.microsoft.com/office/word/2010/wordprocessingCanvas" xmlns:mo="http://schemas.microsoft.com/office/mac/office/2008/main" xmlns:mc="http://schemas.openxmlformats.org/markup-compatibility/2006" xmlns:mv="urn:schemas-microsoft-com:mac:vml" xmlns:o="urn:schemas-microsoft-com:office:office" xmlns:r="http://schemas.openxmlformats.org/officeDocument/2006/relationships" xmlns:m="http://schemas.openxmlformats.org/officeDocument/2006/math" xmlns:v="urn:schemas-microsoft-com:vml" xmlns:wp14="http://schemas.microsoft.com/office/word/2010/wordprocessingDrawing" xmlns:wp="http://schemas.openxmlformats.org/drawingml/2006/wordprocessingDrawing" xmlns:w10="urn:schemas-microsoft-com:office:word" xmlns:w="http://schemas.openxmlformats.org/wordprocessingml/2006/main" xmlns:w14="http://schemas.microsoft.com/office/word/2010/wordml" xmlns:wpg="http://schemas.microsoft.com/office/word/2010/wordprocessingGroup" xmlns:wpi="http://schemas.microsoft.com/office/word/2010/wordprocessingInk" xmlns:wne="http://schemas.microsoft.com/office/word/2006/wordml" xmlns:wps="http://schemas.microsoft.com/office/word/2010/wordprocessingShape" mc:Ignorable="w14 wp14">
   <w:body>
+    <w:p>
+      <w:pPr>
+        <w:spacing w:before="0" w:after="80"/>
+      </w:pPr>
+      <w:r>
+        <w:rPr>
+          <w:rFonts w:ascii="Times New Roman" w:hAnsi="Times New Roman"/>
+          <w:b w:val="0"/>
+          <w:sz w:val="19"/>
+          <w:u w:val="single"/>
+        </w:rPr>
+        <w:t>Table 1: Read Dates &amp; Incubation Observation</w:t>
+      </w:r>
+    </w:p>
     <w:tbl>
       <w:tblPr>
         <w:tblW w:type="auto" w:w="0"/>
@@ -22,8 +36,7 @@
       <w:tr>
         <w:tc>
           <w:tcPr>
-            <w:tcW w:type="dxa" w:w="2160"/>
-            <w:shd w:fill="E8E8E8"/>
+            <w:tcW w:type="dxa" w:w="1368"/>
             <w:tcBorders>
               <w:top w:val="single" w:sz="4" w:space="0" w:color="auto"/>
               <w:bottom w:val="single" w:sz="4" w:space="0" w:color="auto"/>
@@ -34,23 +47,22 @@
           <w:p>
             <w:pPr>
               <w:spacing w:before="0" w:after="0"/>
-              <w:jc w:val="left"/>
+              <w:jc w:val="center"/>
             </w:pPr>
             <w:r>
               <w:rPr>
                 <w:rFonts w:ascii="Times New Roman" w:hAnsi="Times New Roman"/>
-                <w:b/>
+                <w:b w:val="0"/>
                 <w:color w:val="000000"/>
-                <w:sz w:val="12"/>
+                <w:sz w:val="13"/>
               </w:rPr>
-              <w:t>Sampling Location</w:t>
+              <w:t>ETX Submission ID</w:t>
             </w:r>
           </w:p>
         </w:tc>
         <w:tc>
           <w:tcPr>
-            <w:tcW w:type="dxa" w:w="1008"/>
-            <w:shd w:fill="E8E8E8"/>
+            <w:tcW w:type="dxa" w:w="1080"/>
             <w:tcBorders>
               <w:top w:val="single" w:sz="4" w:space="0" w:color="auto"/>
               <w:bottom w:val="single" w:sz="4" w:space="0" w:color="auto"/>
@@ -61,25 +73,24 @@
           <w:p>
             <w:pPr>
               <w:spacing w:before="0" w:after="0"/>
-              <w:jc w:val="left"/>
+              <w:jc w:val="center"/>
             </w:pPr>
             <w:r>
               <w:rPr>
                 <w:rFonts w:ascii="Times New Roman" w:hAnsi="Times New Roman"/>
-                <w:b/>
+                <w:b w:val="0"/>
                 <w:color w:val="000000"/>
-                <w:sz w:val="12"/>
+                <w:sz w:val="13"/>
               </w:rPr>
-              <w:t>Read Date</w:t>
+              <w:t>Set-up Analyst</w:t>
               <w:br/>
-              <w:t>(30-35°C, NLT 48h)</w:t>
+              <w:t>&amp; Date</w:t>
             </w:r>
           </w:p>
         </w:tc>
         <w:tc>
           <w:tcPr>
-            <w:tcW w:type="dxa" w:w="576"/>
-            <w:shd w:fill="E8E8E8"/>
+            <w:tcW w:type="dxa" w:w="1224"/>
             <w:tcBorders>
               <w:top w:val="single" w:sz="4" w:space="0" w:color="auto"/>
               <w:bottom w:val="single" w:sz="4" w:space="0" w:color="auto"/>
@@ -90,25 +101,24 @@
           <w:p>
             <w:pPr>
               <w:spacing w:before="0" w:after="0"/>
-              <w:jc w:val="left"/>
+              <w:jc w:val="center"/>
             </w:pPr>
             <w:r>
               <w:rPr>
                 <w:rFonts w:ascii="Times New Roman" w:hAnsi="Times New Roman"/>
-                <w:b/>
+                <w:b w:val="0"/>
                 <w:color w:val="000000"/>
-                <w:sz w:val="12"/>
+                <w:sz w:val="13"/>
               </w:rPr>
-              <w:t>Read</w:t>
+              <w:t>Sampling Site &amp;</w:t>
               <w:br/>
-              <w:t>By</w:t>
+              <w:t>Location</w:t>
             </w:r>
           </w:p>
         </w:tc>
         <w:tc>
           <w:tcPr>
-            <w:tcW w:type="dxa" w:w="1296"/>
-            <w:shd w:fill="E8E8E8"/>
+            <w:tcW w:type="dxa" w:w="936"/>
             <w:tcBorders>
               <w:top w:val="single" w:sz="4" w:space="0" w:color="auto"/>
               <w:bottom w:val="single" w:sz="4" w:space="0" w:color="auto"/>
@@ -119,25 +129,28 @@
           <w:p>
             <w:pPr>
               <w:spacing w:before="0" w:after="0"/>
-              <w:jc w:val="left"/>
+              <w:jc w:val="center"/>
             </w:pPr>
             <w:r>
               <w:rPr>
                 <w:rFonts w:ascii="Times New Roman" w:hAnsi="Times New Roman"/>
-                <w:b/>
+                <w:b w:val="0"/>
                 <w:color w:val="000000"/>
-                <w:sz w:val="12"/>
+                <w:sz w:val="13"/>
               </w:rPr>
-              <w:t>CFU Count /</w:t>
+              <w:t>Plate</w:t>
               <w:br/>
-              <w:t>Observation</w:t>
+              <w:t>Reading</w:t>
+              <w:br/>
+              <w:t>Analyst (≥</w:t>
+              <w:br/>
+              <w:t>48H)</w:t>
             </w:r>
           </w:p>
         </w:tc>
         <w:tc>
           <w:tcPr>
-            <w:tcW w:type="dxa" w:w="1008"/>
-            <w:shd w:fill="E8E8E8"/>
+            <w:tcW w:type="dxa" w:w="1512"/>
             <w:tcBorders>
               <w:top w:val="single" w:sz="4" w:space="0" w:color="auto"/>
               <w:bottom w:val="single" w:sz="4" w:space="0" w:color="auto"/>
@@ -148,25 +161,28 @@
           <w:p>
             <w:pPr>
               <w:spacing w:before="0" w:after="0"/>
-              <w:jc w:val="left"/>
+              <w:jc w:val="center"/>
             </w:pPr>
             <w:r>
               <w:rPr>
                 <w:rFonts w:ascii="Times New Roman" w:hAnsi="Times New Roman"/>
-                <w:b/>
+                <w:b w:val="0"/>
                 <w:color w:val="000000"/>
-                <w:sz w:val="12"/>
+                <w:sz w:val="13"/>
               </w:rPr>
-              <w:t>Read Date</w:t>
+              <w:t>CFUs Observed after</w:t>
               <w:br/>
-              <w:t>(20-25°C, NLT 5d)</w:t>
+              <w:t>48 Hour Incubation</w:t>
+              <w:br/>
+              <w:t>at 30–35°C</w:t>
+              <w:br/>
+              <w:t>(E001031)</w:t>
             </w:r>
           </w:p>
         </w:tc>
         <w:tc>
           <w:tcPr>
-            <w:tcW w:type="dxa" w:w="576"/>
-            <w:shd w:fill="E8E8E8"/>
+            <w:tcW w:type="dxa" w:w="936"/>
             <w:tcBorders>
               <w:top w:val="single" w:sz="4" w:space="0" w:color="auto"/>
               <w:bottom w:val="single" w:sz="4" w:space="0" w:color="auto"/>
@@ -177,25 +193,30 @@
           <w:p>
             <w:pPr>
               <w:spacing w:before="0" w:after="0"/>
-              <w:jc w:val="left"/>
+              <w:jc w:val="center"/>
             </w:pPr>
             <w:r>
               <w:rPr>
                 <w:rFonts w:ascii="Times New Roman" w:hAnsi="Times New Roman"/>
-                <w:b/>
+                <w:b w:val="0"/>
                 <w:color w:val="000000"/>
-                <w:sz w:val="12"/>
+                <w:sz w:val="13"/>
               </w:rPr>
-              <w:t>Read</w:t>
+              <w:t>Plate</w:t>
               <w:br/>
-              <w:t>By</w:t>
+              <w:t>Reading</w:t>
+              <w:br/>
+              <w:t>Analyst</w:t>
+              <w:br/>
+              <w:t>(NLT 5</w:t>
+              <w:br/>
+              <w:t>days)</w:t>
             </w:r>
           </w:p>
         </w:tc>
         <w:tc>
           <w:tcPr>
-            <w:tcW w:type="dxa" w:w="1296"/>
-            <w:shd w:fill="E8E8E8"/>
+            <w:tcW w:type="dxa" w:w="1512"/>
             <w:tcBorders>
               <w:top w:val="single" w:sz="4" w:space="0" w:color="auto"/>
               <w:bottom w:val="single" w:sz="4" w:space="0" w:color="auto"/>
@@ -206,25 +227,28 @@
           <w:p>
             <w:pPr>
               <w:spacing w:before="0" w:after="0"/>
-              <w:jc w:val="left"/>
+              <w:jc w:val="center"/>
             </w:pPr>
             <w:r>
               <w:rPr>
                 <w:rFonts w:ascii="Times New Roman" w:hAnsi="Times New Roman"/>
-                <w:b/>
+                <w:b w:val="0"/>
                 <w:color w:val="000000"/>
-                <w:sz w:val="12"/>
+                <w:sz w:val="13"/>
               </w:rPr>
-              <w:t>CFU Count /</w:t>
+              <w:t>CFUs Observed</w:t>
               <w:br/>
-              <w:t>Observation</w:t>
+              <w:t>after NLT 5-day</w:t>
+              <w:br/>
+              <w:t>Incubation at</w:t>
+              <w:br/>
+              <w:t>20–25°C (E001034)</w:t>
             </w:r>
           </w:p>
         </w:tc>
         <w:tc>
           <w:tcPr>
-            <w:tcW w:type="dxa" w:w="1440"/>
-            <w:shd w:fill="E8E8E8"/>
+            <w:tcW w:type="dxa" w:w="792"/>
             <w:tcBorders>
               <w:top w:val="single" w:sz="4" w:space="0" w:color="auto"/>
               <w:bottom w:val="single" w:sz="4" w:space="0" w:color="auto"/>
@@ -235,14 +259,14 @@
           <w:p>
             <w:pPr>
               <w:spacing w:before="0" w:after="0"/>
-              <w:jc w:val="left"/>
+              <w:jc w:val="center"/>
             </w:pPr>
             <w:r>
               <w:rPr>
                 <w:rFonts w:ascii="Times New Roman" w:hAnsi="Times New Roman"/>
-                <w:b/>
+                <w:b w:val="0"/>
                 <w:color w:val="000000"/>
-                <w:sz w:val="12"/>
+                <w:sz w:val="13"/>
               </w:rPr>
               <w:t>Microbial Identification</w:t>
             </w:r>
@@ -252,8 +276,7 @@
       <w:tr>
         <w:tc>
           <w:tcPr>
-            <w:tcW w:type="dxa" w:w="2160"/>
-            <w:shd w:fill="FFFFFF"/>
+            <w:tcW w:type="dxa" w:w="1368"/>
             <w:tcBorders>
               <w:top w:val="single" w:sz="4" w:space="0" w:color="auto"/>
               <w:bottom w:val="single" w:sz="4" w:space="0" w:color="auto"/>
@@ -264,23 +287,22 @@
           <w:p>
             <w:pPr>
               <w:spacing w:before="0" w:after="0"/>
-              <w:jc w:val="left"/>
+              <w:jc w:val="center"/>
             </w:pPr>
             <w:r>
               <w:rPr>
                 <w:rFonts w:ascii="Times New Roman" w:hAnsi="Times New Roman"/>
                 <w:b w:val="0"/>
                 <w:color w:val="000000"/>
-                <w:sz w:val="14"/>
+                <w:sz w:val="13"/>
               </w:rPr>
-              <w:t>Surface Sampling (Changeover) Plate (BSC E001309)</w:t>
+              <w:t>ETX-260518-0273</w:t>
             </w:r>
           </w:p>
         </w:tc>
         <w:tc>
           <w:tcPr>
-            <w:tcW w:type="dxa" w:w="1008"/>
-            <w:shd w:fill="FFFFFF"/>
+            <w:tcW w:type="dxa" w:w="1080"/>
             <w:tcBorders>
               <w:top w:val="single" w:sz="4" w:space="0" w:color="auto"/>
               <w:bottom w:val="single" w:sz="4" w:space="0" w:color="auto"/>
@@ -291,23 +313,26 @@
           <w:p>
             <w:pPr>
               <w:spacing w:before="0" w:after="0"/>
-              <w:jc w:val="left"/>
+              <w:jc w:val="center"/>
             </w:pPr>
             <w:r>
               <w:rPr>
                 <w:rFonts w:ascii="Times New Roman" w:hAnsi="Times New Roman"/>
                 <w:b w:val="0"/>
                 <w:color w:val="000000"/>
-                <w:sz w:val="14"/>
+                <w:sz w:val="13"/>
               </w:rPr>
-              <w:t>13 May 2026</w:t>
+              <w:t>CGS</w:t>
+              <w:br/>
+              <w:t>11MAY</w:t>
+              <w:br/>
+              <w:t>2026</w:t>
             </w:r>
           </w:p>
         </w:tc>
         <w:tc>
           <w:tcPr>
-            <w:tcW w:type="dxa" w:w="576"/>
-            <w:shd w:fill="FFFFFF"/>
+            <w:tcW w:type="dxa" w:w="1224"/>
             <w:tcBorders>
               <w:top w:val="single" w:sz="4" w:space="0" w:color="auto"/>
               <w:bottom w:val="single" w:sz="4" w:space="0" w:color="auto"/>
@@ -318,23 +343,24 @@
           <w:p>
             <w:pPr>
               <w:spacing w:before="0" w:after="0"/>
-              <w:jc w:val="left"/>
+              <w:jc w:val="center"/>
             </w:pPr>
             <w:r>
               <w:rPr>
                 <w:rFonts w:ascii="Times New Roman" w:hAnsi="Times New Roman"/>
                 <w:b w:val="0"/>
                 <w:color w:val="000000"/>
-                <w:sz w:val="14"/>
+                <w:sz w:val="13"/>
               </w:rPr>
-              <w:t>MC</w:t>
+              <w:t>Surface</w:t>
+              <w:br/>
+              <w:t>sampling plate</w:t>
             </w:r>
           </w:p>
         </w:tc>
         <w:tc>
           <w:tcPr>
-            <w:tcW w:type="dxa" w:w="1296"/>
-            <w:shd w:fill="FFFFFF"/>
+            <w:tcW w:type="dxa" w:w="936"/>
             <w:tcBorders>
               <w:top w:val="single" w:sz="4" w:space="0" w:color="auto"/>
               <w:bottom w:val="single" w:sz="4" w:space="0" w:color="auto"/>
@@ -345,23 +371,22 @@
           <w:p>
             <w:pPr>
               <w:spacing w:before="0" w:after="0"/>
-              <w:jc w:val="left"/>
+              <w:jc w:val="center"/>
             </w:pPr>
             <w:r>
               <w:rPr>
                 <w:rFonts w:ascii="Times New Roman" w:hAnsi="Times New Roman"/>
                 <w:b w:val="0"/>
                 <w:color w:val="000000"/>
-                <w:sz w:val="14"/>
+                <w:sz w:val="13"/>
               </w:rPr>
-              <w:t>No microbial growth was observed</w:t>
+              <w:t>MC</w:t>
             </w:r>
           </w:p>
         </w:tc>
         <w:tc>
           <w:tcPr>
-            <w:tcW w:type="dxa" w:w="1008"/>
-            <w:shd w:fill="FFFFFF"/>
+            <w:tcW w:type="dxa" w:w="1512"/>
             <w:tcBorders>
               <w:top w:val="single" w:sz="4" w:space="0" w:color="auto"/>
               <w:bottom w:val="single" w:sz="4" w:space="0" w:color="auto"/>
@@ -372,23 +397,22 @@
           <w:p>
             <w:pPr>
               <w:spacing w:before="0" w:after="0"/>
-              <w:jc w:val="left"/>
+              <w:jc w:val="center"/>
             </w:pPr>
             <w:r>
               <w:rPr>
                 <w:rFonts w:ascii="Times New Roman" w:hAnsi="Times New Roman"/>
                 <w:b w:val="0"/>
                 <w:color w:val="000000"/>
-                <w:sz w:val="14"/>
+                <w:sz w:val="13"/>
               </w:rPr>
-              <w:t>18 May 2026</w:t>
+              <w:t>0</w:t>
             </w:r>
           </w:p>
         </w:tc>
         <w:tc>
           <w:tcPr>
-            <w:tcW w:type="dxa" w:w="576"/>
-            <w:shd w:fill="FFFFFF"/>
+            <w:tcW w:type="dxa" w:w="936"/>
             <w:tcBorders>
               <w:top w:val="single" w:sz="4" w:space="0" w:color="auto"/>
               <w:bottom w:val="single" w:sz="4" w:space="0" w:color="auto"/>
@@ -399,14 +423,14 @@
           <w:p>
             <w:pPr>
               <w:spacing w:before="0" w:after="0"/>
-              <w:jc w:val="left"/>
+              <w:jc w:val="center"/>
             </w:pPr>
             <w:r>
               <w:rPr>
                 <w:rFonts w:ascii="Times New Roman" w:hAnsi="Times New Roman"/>
                 <w:b w:val="0"/>
                 <w:color w:val="000000"/>
-                <w:sz w:val="14"/>
+                <w:sz w:val="13"/>
               </w:rPr>
               <w:t>SAS</w:t>
             </w:r>
@@ -414,8 +438,7 @@
         </w:tc>
         <w:tc>
           <w:tcPr>
-            <w:tcW w:type="dxa" w:w="1296"/>
-            <w:shd w:fill="FFFFFF"/>
+            <w:tcW w:type="dxa" w:w="1512"/>
             <w:tcBorders>
               <w:top w:val="single" w:sz="4" w:space="0" w:color="auto"/>
               <w:bottom w:val="single" w:sz="4" w:space="0" w:color="auto"/>
@@ -426,23 +449,26 @@
           <w:p>
             <w:pPr>
               <w:spacing w:before="0" w:after="0"/>
-              <w:jc w:val="left"/>
+              <w:jc w:val="center"/>
             </w:pPr>
             <w:r>
               <w:rPr>
                 <w:rFonts w:ascii="Times New Roman" w:hAnsi="Times New Roman"/>
                 <w:b w:val="0"/>
                 <w:color w:val="000000"/>
-                <w:sz w:val="14"/>
+                <w:sz w:val="13"/>
               </w:rPr>
-              <w:t>1 CFU on ScanC/O CGS E001309 S1 11MAY2026</w:t>
+              <w:t>1 CFU on surface</w:t>
+              <w:br/>
+              <w:t>#1 sampling</w:t>
+              <w:br/>
+              <w:t>plate</w:t>
             </w:r>
           </w:p>
         </w:tc>
         <w:tc>
           <w:tcPr>
-            <w:tcW w:type="dxa" w:w="1440"/>
-            <w:shd w:fill="FFFFFF"/>
+            <w:tcW w:type="dxa" w:w="792"/>
             <w:tcBorders>
               <w:top w:val="single" w:sz="4" w:space="0" w:color="auto"/>
               <w:bottom w:val="single" w:sz="4" w:space="0" w:color="auto"/>
@@ -453,16 +479,16 @@
           <w:p>
             <w:pPr>
               <w:spacing w:before="0" w:after="0"/>
-              <w:jc w:val="left"/>
+              <w:jc w:val="center"/>
             </w:pPr>
             <w:r>
               <w:rPr>
                 <w:rFonts w:ascii="Times New Roman" w:hAnsi="Times New Roman"/>
                 <w:b w:val="0"/>
                 <w:color w:val="000000"/>
-                <w:sz w:val="14"/>
+                <w:sz w:val="13"/>
               </w:rPr>
-              <w:t>White, shiny, hardened, smooth area embeded on agar</w:t>
+              <w:t>N/A</w:t>
             </w:r>
           </w:p>
         </w:tc>
@@ -470,8 +496,17 @@
     </w:tbl>
     <w:p>
       <w:pPr>
-        <w:spacing w:before="120" w:after="120"/>
+        <w:spacing w:before="280" w:after="80"/>
       </w:pPr>
+      <w:r>
+        <w:rPr>
+          <w:rFonts w:ascii="Times New Roman" w:hAnsi="Times New Roman"/>
+          <w:b w:val="0"/>
+          <w:sz w:val="19"/>
+          <w:u w:val="single"/>
+        </w:rPr>
+        <w:t>Table 2: Environmental Monitoring Plates for Analyst and Cleanroom Bracketing</w:t>
+      </w:r>
     </w:p>
     <w:tbl>
       <w:tblPr>

</xml_diff>

<commit_message>
fix(em): perfectly align Table 1 & Table 2 right margins and fix word-breaking on Frequency and Microbial Identification
</commit_message>
<xml_diff>
--- a/EM_table_OOS-261187_11MAY2026.docx
+++ b/EM_table_OOS-261187_11MAY2026.docx
@@ -24,25 +24,31 @@
         <w:tblLook w:firstColumn="1" w:firstRow="1" w:lastColumn="0" w:lastRow="0" w:noHBand="0" w:noVBand="1" w:val="04A0"/>
       </w:tblPr>
       <w:tblGrid>
-        <w:gridCol w:w="1170"/>
-        <w:gridCol w:w="1170"/>
-        <w:gridCol w:w="1170"/>
-        <w:gridCol w:w="1170"/>
-        <w:gridCol w:w="1170"/>
-        <w:gridCol w:w="1170"/>
-        <w:gridCol w:w="1170"/>
-        <w:gridCol w:w="1170"/>
+        <w:gridCol w:w="1260"/>
+        <w:gridCol w:w="1260"/>
+        <w:gridCol w:w="1260"/>
+        <w:gridCol w:w="1260"/>
+        <w:gridCol w:w="1260"/>
+        <w:gridCol w:w="1260"/>
+        <w:gridCol w:w="1260"/>
+        <w:gridCol w:w="1260"/>
       </w:tblGrid>
       <w:tr>
         <w:tc>
           <w:tcPr>
-            <w:tcW w:type="dxa" w:w="1368"/>
+            <w:tcW w:type="dxa" w:w="1296"/>
             <w:tcBorders>
               <w:top w:val="single" w:sz="4" w:space="0" w:color="auto"/>
               <w:bottom w:val="single" w:sz="4" w:space="0" w:color="auto"/>
               <w:left w:val="single" w:sz="4" w:space="0" w:color="auto"/>
               <w:right w:val="single" w:sz="4" w:space="0" w:color="auto"/>
             </w:tcBorders>
+            <w:tcMar>
+              <w:top w:w="30" w:type="dxa"/>
+              <w:bottom w:w="30" w:type="dxa"/>
+              <w:left w:w="30" w:type="dxa"/>
+              <w:right w:w="30" w:type="dxa"/>
+            </w:tcMar>
           </w:tcPr>
           <w:p>
             <w:pPr>
@@ -69,6 +75,12 @@
               <w:left w:val="single" w:sz="4" w:space="0" w:color="auto"/>
               <w:right w:val="single" w:sz="4" w:space="0" w:color="auto"/>
             </w:tcBorders>
+            <w:tcMar>
+              <w:top w:w="30" w:type="dxa"/>
+              <w:bottom w:w="30" w:type="dxa"/>
+              <w:left w:w="30" w:type="dxa"/>
+              <w:right w:w="30" w:type="dxa"/>
+            </w:tcMar>
           </w:tcPr>
           <w:p>
             <w:pPr>
@@ -97,6 +109,12 @@
               <w:left w:val="single" w:sz="4" w:space="0" w:color="auto"/>
               <w:right w:val="single" w:sz="4" w:space="0" w:color="auto"/>
             </w:tcBorders>
+            <w:tcMar>
+              <w:top w:w="30" w:type="dxa"/>
+              <w:bottom w:w="30" w:type="dxa"/>
+              <w:left w:w="30" w:type="dxa"/>
+              <w:right w:w="30" w:type="dxa"/>
+            </w:tcMar>
           </w:tcPr>
           <w:p>
             <w:pPr>
@@ -125,6 +143,12 @@
               <w:left w:val="single" w:sz="4" w:space="0" w:color="auto"/>
               <w:right w:val="single" w:sz="4" w:space="0" w:color="auto"/>
             </w:tcBorders>
+            <w:tcMar>
+              <w:top w:w="30" w:type="dxa"/>
+              <w:bottom w:w="30" w:type="dxa"/>
+              <w:left w:w="30" w:type="dxa"/>
+              <w:right w:w="30" w:type="dxa"/>
+            </w:tcMar>
           </w:tcPr>
           <w:p>
             <w:pPr>
@@ -150,13 +174,19 @@
         </w:tc>
         <w:tc>
           <w:tcPr>
-            <w:tcW w:type="dxa" w:w="1512"/>
+            <w:tcW w:type="dxa" w:w="1584"/>
             <w:tcBorders>
               <w:top w:val="single" w:sz="4" w:space="0" w:color="auto"/>
               <w:bottom w:val="single" w:sz="4" w:space="0" w:color="auto"/>
               <w:left w:val="single" w:sz="4" w:space="0" w:color="auto"/>
               <w:right w:val="single" w:sz="4" w:space="0" w:color="auto"/>
             </w:tcBorders>
+            <w:tcMar>
+              <w:top w:w="30" w:type="dxa"/>
+              <w:bottom w:w="30" w:type="dxa"/>
+              <w:left w:w="30" w:type="dxa"/>
+              <w:right w:w="30" w:type="dxa"/>
+            </w:tcMar>
           </w:tcPr>
           <w:p>
             <w:pPr>
@@ -189,6 +219,12 @@
               <w:left w:val="single" w:sz="4" w:space="0" w:color="auto"/>
               <w:right w:val="single" w:sz="4" w:space="0" w:color="auto"/>
             </w:tcBorders>
+            <w:tcMar>
+              <w:top w:w="30" w:type="dxa"/>
+              <w:bottom w:w="30" w:type="dxa"/>
+              <w:left w:w="30" w:type="dxa"/>
+              <w:right w:w="30" w:type="dxa"/>
+            </w:tcMar>
           </w:tcPr>
           <w:p>
             <w:pPr>
@@ -216,13 +252,19 @@
         </w:tc>
         <w:tc>
           <w:tcPr>
-            <w:tcW w:type="dxa" w:w="1512"/>
+            <w:tcW w:type="dxa" w:w="1584"/>
             <w:tcBorders>
               <w:top w:val="single" w:sz="4" w:space="0" w:color="auto"/>
               <w:bottom w:val="single" w:sz="4" w:space="0" w:color="auto"/>
               <w:left w:val="single" w:sz="4" w:space="0" w:color="auto"/>
               <w:right w:val="single" w:sz="4" w:space="0" w:color="auto"/>
             </w:tcBorders>
+            <w:tcMar>
+              <w:top w:w="30" w:type="dxa"/>
+              <w:bottom w:w="30" w:type="dxa"/>
+              <w:left w:w="30" w:type="dxa"/>
+              <w:right w:w="30" w:type="dxa"/>
+            </w:tcMar>
           </w:tcPr>
           <w:p>
             <w:pPr>
@@ -248,13 +290,19 @@
         </w:tc>
         <w:tc>
           <w:tcPr>
-            <w:tcW w:type="dxa" w:w="792"/>
+            <w:tcW w:type="dxa" w:w="1440"/>
             <w:tcBorders>
               <w:top w:val="single" w:sz="4" w:space="0" w:color="auto"/>
               <w:bottom w:val="single" w:sz="4" w:space="0" w:color="auto"/>
               <w:left w:val="single" w:sz="4" w:space="0" w:color="auto"/>
               <w:right w:val="single" w:sz="4" w:space="0" w:color="auto"/>
             </w:tcBorders>
+            <w:tcMar>
+              <w:top w:w="30" w:type="dxa"/>
+              <w:bottom w:w="30" w:type="dxa"/>
+              <w:left w:w="30" w:type="dxa"/>
+              <w:right w:w="30" w:type="dxa"/>
+            </w:tcMar>
           </w:tcPr>
           <w:p>
             <w:pPr>
@@ -268,7 +316,9 @@
                 <w:color w:val="000000"/>
                 <w:sz w:val="13"/>
               </w:rPr>
-              <w:t>Microbial Identification</w:t>
+              <w:t>Microbial</w:t>
+              <w:br/>
+              <w:t>Identification</w:t>
             </w:r>
           </w:p>
         </w:tc>
@@ -276,13 +326,19 @@
       <w:tr>
         <w:tc>
           <w:tcPr>
-            <w:tcW w:type="dxa" w:w="1368"/>
+            <w:tcW w:type="dxa" w:w="1296"/>
             <w:tcBorders>
               <w:top w:val="single" w:sz="4" w:space="0" w:color="auto"/>
               <w:bottom w:val="single" w:sz="4" w:space="0" w:color="auto"/>
               <w:left w:val="single" w:sz="4" w:space="0" w:color="auto"/>
               <w:right w:val="single" w:sz="4" w:space="0" w:color="auto"/>
             </w:tcBorders>
+            <w:tcMar>
+              <w:top w:w="30" w:type="dxa"/>
+              <w:bottom w:w="30" w:type="dxa"/>
+              <w:left w:w="30" w:type="dxa"/>
+              <w:right w:w="30" w:type="dxa"/>
+            </w:tcMar>
           </w:tcPr>
           <w:p>
             <w:pPr>
@@ -309,6 +365,12 @@
               <w:left w:val="single" w:sz="4" w:space="0" w:color="auto"/>
               <w:right w:val="single" w:sz="4" w:space="0" w:color="auto"/>
             </w:tcBorders>
+            <w:tcMar>
+              <w:top w:w="30" w:type="dxa"/>
+              <w:bottom w:w="30" w:type="dxa"/>
+              <w:left w:w="30" w:type="dxa"/>
+              <w:right w:w="30" w:type="dxa"/>
+            </w:tcMar>
           </w:tcPr>
           <w:p>
             <w:pPr>
@@ -339,6 +401,12 @@
               <w:left w:val="single" w:sz="4" w:space="0" w:color="auto"/>
               <w:right w:val="single" w:sz="4" w:space="0" w:color="auto"/>
             </w:tcBorders>
+            <w:tcMar>
+              <w:top w:w="30" w:type="dxa"/>
+              <w:bottom w:w="30" w:type="dxa"/>
+              <w:left w:w="30" w:type="dxa"/>
+              <w:right w:w="30" w:type="dxa"/>
+            </w:tcMar>
           </w:tcPr>
           <w:p>
             <w:pPr>
@@ -367,6 +435,12 @@
               <w:left w:val="single" w:sz="4" w:space="0" w:color="auto"/>
               <w:right w:val="single" w:sz="4" w:space="0" w:color="auto"/>
             </w:tcBorders>
+            <w:tcMar>
+              <w:top w:w="30" w:type="dxa"/>
+              <w:bottom w:w="30" w:type="dxa"/>
+              <w:left w:w="30" w:type="dxa"/>
+              <w:right w:w="30" w:type="dxa"/>
+            </w:tcMar>
           </w:tcPr>
           <w:p>
             <w:pPr>
@@ -386,13 +460,19 @@
         </w:tc>
         <w:tc>
           <w:tcPr>
-            <w:tcW w:type="dxa" w:w="1512"/>
+            <w:tcW w:type="dxa" w:w="1584"/>
             <w:tcBorders>
               <w:top w:val="single" w:sz="4" w:space="0" w:color="auto"/>
               <w:bottom w:val="single" w:sz="4" w:space="0" w:color="auto"/>
               <w:left w:val="single" w:sz="4" w:space="0" w:color="auto"/>
               <w:right w:val="single" w:sz="4" w:space="0" w:color="auto"/>
             </w:tcBorders>
+            <w:tcMar>
+              <w:top w:w="30" w:type="dxa"/>
+              <w:bottom w:w="30" w:type="dxa"/>
+              <w:left w:w="30" w:type="dxa"/>
+              <w:right w:w="30" w:type="dxa"/>
+            </w:tcMar>
           </w:tcPr>
           <w:p>
             <w:pPr>
@@ -419,6 +499,12 @@
               <w:left w:val="single" w:sz="4" w:space="0" w:color="auto"/>
               <w:right w:val="single" w:sz="4" w:space="0" w:color="auto"/>
             </w:tcBorders>
+            <w:tcMar>
+              <w:top w:w="30" w:type="dxa"/>
+              <w:bottom w:w="30" w:type="dxa"/>
+              <w:left w:w="30" w:type="dxa"/>
+              <w:right w:w="30" w:type="dxa"/>
+            </w:tcMar>
           </w:tcPr>
           <w:p>
             <w:pPr>
@@ -438,13 +524,19 @@
         </w:tc>
         <w:tc>
           <w:tcPr>
-            <w:tcW w:type="dxa" w:w="1512"/>
+            <w:tcW w:type="dxa" w:w="1584"/>
             <w:tcBorders>
               <w:top w:val="single" w:sz="4" w:space="0" w:color="auto"/>
               <w:bottom w:val="single" w:sz="4" w:space="0" w:color="auto"/>
               <w:left w:val="single" w:sz="4" w:space="0" w:color="auto"/>
               <w:right w:val="single" w:sz="4" w:space="0" w:color="auto"/>
             </w:tcBorders>
+            <w:tcMar>
+              <w:top w:w="30" w:type="dxa"/>
+              <w:bottom w:w="30" w:type="dxa"/>
+              <w:left w:w="30" w:type="dxa"/>
+              <w:right w:w="30" w:type="dxa"/>
+            </w:tcMar>
           </w:tcPr>
           <w:p>
             <w:pPr>
@@ -468,13 +560,19 @@
         </w:tc>
         <w:tc>
           <w:tcPr>
-            <w:tcW w:type="dxa" w:w="792"/>
+            <w:tcW w:type="dxa" w:w="1440"/>
             <w:tcBorders>
               <w:top w:val="single" w:sz="4" w:space="0" w:color="auto"/>
               <w:bottom w:val="single" w:sz="4" w:space="0" w:color="auto"/>
               <w:left w:val="single" w:sz="4" w:space="0" w:color="auto"/>
               <w:right w:val="single" w:sz="4" w:space="0" w:color="auto"/>
             </w:tcBorders>
+            <w:tcMar>
+              <w:top w:w="30" w:type="dxa"/>
+              <w:bottom w:w="30" w:type="dxa"/>
+              <w:left w:w="30" w:type="dxa"/>
+              <w:right w:w="30" w:type="dxa"/>
+            </w:tcMar>
           </w:tcPr>
           <w:p>
             <w:pPr>
@@ -516,26 +614,32 @@
         <w:tblLook w:firstColumn="1" w:firstRow="1" w:lastColumn="0" w:lastRow="0" w:noHBand="0" w:noVBand="1" w:val="04A0"/>
       </w:tblPr>
       <w:tblGrid>
-        <w:gridCol w:w="1040"/>
-        <w:gridCol w:w="1040"/>
-        <w:gridCol w:w="1040"/>
-        <w:gridCol w:w="1040"/>
-        <w:gridCol w:w="1040"/>
-        <w:gridCol w:w="1040"/>
-        <w:gridCol w:w="1040"/>
-        <w:gridCol w:w="1040"/>
-        <w:gridCol w:w="1040"/>
+        <w:gridCol w:w="1120"/>
+        <w:gridCol w:w="1120"/>
+        <w:gridCol w:w="1120"/>
+        <w:gridCol w:w="1120"/>
+        <w:gridCol w:w="1120"/>
+        <w:gridCol w:w="1120"/>
+        <w:gridCol w:w="1120"/>
+        <w:gridCol w:w="1120"/>
+        <w:gridCol w:w="1120"/>
       </w:tblGrid>
       <w:tr>
         <w:tc>
           <w:tcPr>
-            <w:tcW w:type="dxa" w:w="1602"/>
+            <w:tcW w:type="dxa" w:w="1656"/>
             <w:tcBorders>
               <w:top w:val="single" w:sz="4" w:space="0" w:color="auto"/>
               <w:bottom w:val="single" w:sz="4" w:space="0" w:color="auto"/>
               <w:left w:val="single" w:sz="4" w:space="0" w:color="auto"/>
               <w:right w:val="single" w:sz="4" w:space="0" w:color="auto"/>
             </w:tcBorders>
+            <w:tcMar>
+              <w:top w:w="30" w:type="dxa"/>
+              <w:bottom w:w="30" w:type="dxa"/>
+              <w:left w:w="30" w:type="dxa"/>
+              <w:right w:w="30" w:type="dxa"/>
+            </w:tcMar>
             <w:shd w:fill="E8E8E8"/>
           </w:tcPr>
           <w:p>
@@ -556,13 +660,19 @@
         </w:tc>
         <w:tc>
           <w:tcPr>
-            <w:tcW w:type="dxa" w:w="759"/>
+            <w:tcW w:type="dxa" w:w="936"/>
             <w:tcBorders>
               <w:top w:val="single" w:sz="4" w:space="0" w:color="auto"/>
               <w:bottom w:val="single" w:sz="4" w:space="0" w:color="auto"/>
               <w:left w:val="single" w:sz="4" w:space="0" w:color="auto"/>
               <w:right w:val="single" w:sz="4" w:space="0" w:color="auto"/>
             </w:tcBorders>
+            <w:tcMar>
+              <w:top w:w="30" w:type="dxa"/>
+              <w:bottom w:w="30" w:type="dxa"/>
+              <w:left w:w="30" w:type="dxa"/>
+              <w:right w:w="30" w:type="dxa"/>
+            </w:tcMar>
             <w:shd w:fill="E8E8E8"/>
           </w:tcPr>
           <w:p>
@@ -583,13 +693,19 @@
         </w:tc>
         <w:tc>
           <w:tcPr>
-            <w:tcW w:type="dxa" w:w="815"/>
+            <w:tcW w:type="dxa" w:w="936"/>
             <w:tcBorders>
               <w:top w:val="single" w:sz="4" w:space="0" w:color="auto"/>
               <w:bottom w:val="single" w:sz="4" w:space="0" w:color="auto"/>
               <w:left w:val="single" w:sz="4" w:space="0" w:color="auto"/>
               <w:right w:val="single" w:sz="4" w:space="0" w:color="auto"/>
             </w:tcBorders>
+            <w:tcMar>
+              <w:top w:w="30" w:type="dxa"/>
+              <w:bottom w:w="30" w:type="dxa"/>
+              <w:left w:w="30" w:type="dxa"/>
+              <w:right w:w="30" w:type="dxa"/>
+            </w:tcMar>
             <w:shd w:fill="E8E8E8"/>
           </w:tcPr>
           <w:p>
@@ -614,13 +730,19 @@
         </w:tc>
         <w:tc>
           <w:tcPr>
-            <w:tcW w:type="dxa" w:w="899"/>
+            <w:tcW w:type="dxa" w:w="864"/>
             <w:tcBorders>
               <w:top w:val="single" w:sz="4" w:space="0" w:color="auto"/>
               <w:bottom w:val="single" w:sz="4" w:space="0" w:color="auto"/>
               <w:left w:val="single" w:sz="4" w:space="0" w:color="auto"/>
               <w:right w:val="single" w:sz="4" w:space="0" w:color="auto"/>
             </w:tcBorders>
+            <w:tcMar>
+              <w:top w:w="30" w:type="dxa"/>
+              <w:bottom w:w="30" w:type="dxa"/>
+              <w:left w:w="30" w:type="dxa"/>
+              <w:right w:w="30" w:type="dxa"/>
+            </w:tcMar>
             <w:shd w:fill="E8E8E8"/>
           </w:tcPr>
           <w:p>
@@ -641,13 +763,19 @@
         </w:tc>
         <w:tc>
           <w:tcPr>
-            <w:tcW w:type="dxa" w:w="1096"/>
+            <w:tcW w:type="dxa" w:w="1152"/>
             <w:tcBorders>
               <w:top w:val="single" w:sz="4" w:space="0" w:color="auto"/>
               <w:bottom w:val="single" w:sz="4" w:space="0" w:color="auto"/>
               <w:left w:val="single" w:sz="4" w:space="0" w:color="auto"/>
               <w:right w:val="single" w:sz="4" w:space="0" w:color="auto"/>
             </w:tcBorders>
+            <w:tcMar>
+              <w:top w:w="30" w:type="dxa"/>
+              <w:bottom w:w="30" w:type="dxa"/>
+              <w:left w:w="30" w:type="dxa"/>
+              <w:right w:w="30" w:type="dxa"/>
+            </w:tcMar>
             <w:shd w:fill="E8E8E8"/>
           </w:tcPr>
           <w:p>
@@ -668,13 +796,19 @@
         </w:tc>
         <w:tc>
           <w:tcPr>
-            <w:tcW w:type="dxa" w:w="1349"/>
+            <w:tcW w:type="dxa" w:w="1296"/>
             <w:tcBorders>
               <w:top w:val="single" w:sz="4" w:space="0" w:color="auto"/>
               <w:bottom w:val="single" w:sz="4" w:space="0" w:color="auto"/>
               <w:left w:val="single" w:sz="4" w:space="0" w:color="auto"/>
               <w:right w:val="single" w:sz="4" w:space="0" w:color="auto"/>
             </w:tcBorders>
+            <w:tcMar>
+              <w:top w:w="30" w:type="dxa"/>
+              <w:bottom w:w="30" w:type="dxa"/>
+              <w:left w:w="30" w:type="dxa"/>
+              <w:right w:w="30" w:type="dxa"/>
+            </w:tcMar>
             <w:shd w:fill="E8E8E8"/>
           </w:tcPr>
           <w:p>
@@ -695,13 +829,19 @@
         </w:tc>
         <w:tc>
           <w:tcPr>
-            <w:tcW w:type="dxa" w:w="1298"/>
+            <w:tcW w:type="dxa" w:w="1368"/>
             <w:tcBorders>
               <w:top w:val="single" w:sz="4" w:space="0" w:color="auto"/>
               <w:bottom w:val="single" w:sz="4" w:space="0" w:color="auto"/>
               <w:left w:val="single" w:sz="4" w:space="0" w:color="auto"/>
               <w:right w:val="single" w:sz="4" w:space="0" w:color="auto"/>
             </w:tcBorders>
+            <w:tcMar>
+              <w:top w:w="30" w:type="dxa"/>
+              <w:bottom w:w="30" w:type="dxa"/>
+              <w:left w:w="30" w:type="dxa"/>
+              <w:right w:w="30" w:type="dxa"/>
+            </w:tcMar>
             <w:shd w:fill="E8E8E8"/>
           </w:tcPr>
           <w:p>
@@ -722,13 +862,19 @@
         </w:tc>
         <w:tc>
           <w:tcPr>
-            <w:tcW w:type="dxa" w:w="1037"/>
+            <w:tcW w:type="dxa" w:w="1224"/>
             <w:tcBorders>
               <w:top w:val="single" w:sz="4" w:space="0" w:color="auto"/>
               <w:bottom w:val="single" w:sz="4" w:space="0" w:color="auto"/>
               <w:left w:val="single" w:sz="4" w:space="0" w:color="auto"/>
               <w:right w:val="single" w:sz="4" w:space="0" w:color="auto"/>
             </w:tcBorders>
+            <w:tcMar>
+              <w:top w:w="30" w:type="dxa"/>
+              <w:bottom w:w="30" w:type="dxa"/>
+              <w:left w:w="30" w:type="dxa"/>
+              <w:right w:w="30" w:type="dxa"/>
+            </w:tcMar>
             <w:shd w:fill="E8E8E8"/>
           </w:tcPr>
           <w:p>
@@ -749,13 +895,19 @@
         </w:tc>
         <w:tc>
           <w:tcPr>
-            <w:tcW w:type="dxa" w:w="608"/>
+            <w:tcW w:type="dxa" w:w="648"/>
             <w:tcBorders>
               <w:top w:val="single" w:sz="4" w:space="0" w:color="auto"/>
               <w:bottom w:val="single" w:sz="4" w:space="0" w:color="auto"/>
               <w:left w:val="single" w:sz="4" w:space="0" w:color="auto"/>
               <w:right w:val="single" w:sz="4" w:space="0" w:color="auto"/>
             </w:tcBorders>
+            <w:tcMar>
+              <w:top w:w="30" w:type="dxa"/>
+              <w:bottom w:w="30" w:type="dxa"/>
+              <w:left w:w="30" w:type="dxa"/>
+              <w:right w:w="30" w:type="dxa"/>
+            </w:tcMar>
             <w:shd w:fill="E8E8E8"/>
           </w:tcPr>
           <w:p>
@@ -778,7 +930,7 @@
       <w:tr>
         <w:tc>
           <w:tcPr>
-            <w:tcW w:type="dxa" w:w="9360"/>
+            <w:tcW w:type="dxa" w:w="10080"/>
             <w:gridSpan w:val="9"/>
             <w:shd w:fill="D9D9D9"/>
             <w:tcBorders>
@@ -787,6 +939,12 @@
               <w:left w:val="single" w:sz="4" w:space="0" w:color="auto"/>
               <w:right w:val="single" w:sz="4" w:space="0" w:color="auto"/>
             </w:tcBorders>
+            <w:tcMar>
+              <w:top w:w="30" w:type="dxa"/>
+              <w:bottom w:w="30" w:type="dxa"/>
+              <w:left w:w="30" w:type="dxa"/>
+              <w:right w:w="30" w:type="dxa"/>
+            </w:tcMar>
           </w:tcPr>
           <w:p>
             <w:pPr>
@@ -808,13 +966,19 @@
       <w:tr>
         <w:tc>
           <w:tcPr>
-            <w:tcW w:type="dxa" w:w="1602"/>
+            <w:tcW w:type="dxa" w:w="1656"/>
             <w:tcBorders>
               <w:top w:val="single" w:sz="4" w:space="0" w:color="auto"/>
               <w:bottom w:val="single" w:sz="4" w:space="0" w:color="auto"/>
               <w:left w:val="single" w:sz="4" w:space="0" w:color="auto"/>
               <w:right w:val="single" w:sz="4" w:space="0" w:color="auto"/>
             </w:tcBorders>
+            <w:tcMar>
+              <w:top w:w="30" w:type="dxa"/>
+              <w:bottom w:w="30" w:type="dxa"/>
+              <w:left w:w="30" w:type="dxa"/>
+              <w:right w:w="30" w:type="dxa"/>
+            </w:tcMar>
             <w:shd w:fill="FFFFFF"/>
           </w:tcPr>
           <w:p>
@@ -835,13 +999,19 @@
         </w:tc>
         <w:tc>
           <w:tcPr>
-            <w:tcW w:type="dxa" w:w="759"/>
+            <w:tcW w:type="dxa" w:w="936"/>
             <w:tcBorders>
               <w:top w:val="single" w:sz="4" w:space="0" w:color="auto"/>
               <w:bottom w:val="single" w:sz="4" w:space="0" w:color="auto"/>
               <w:left w:val="single" w:sz="4" w:space="0" w:color="auto"/>
               <w:right w:val="single" w:sz="4" w:space="0" w:color="auto"/>
             </w:tcBorders>
+            <w:tcMar>
+              <w:top w:w="30" w:type="dxa"/>
+              <w:bottom w:w="30" w:type="dxa"/>
+              <w:left w:w="30" w:type="dxa"/>
+              <w:right w:w="30" w:type="dxa"/>
+            </w:tcMar>
             <w:shd w:fill="FFFFFF"/>
           </w:tcPr>
           <w:p>
@@ -862,13 +1032,19 @@
         </w:tc>
         <w:tc>
           <w:tcPr>
-            <w:tcW w:type="dxa" w:w="815"/>
+            <w:tcW w:type="dxa" w:w="936"/>
             <w:tcBorders>
               <w:top w:val="single" w:sz="4" w:space="0" w:color="auto"/>
               <w:bottom w:val="single" w:sz="4" w:space="0" w:color="auto"/>
               <w:left w:val="single" w:sz="4" w:space="0" w:color="auto"/>
               <w:right w:val="single" w:sz="4" w:space="0" w:color="auto"/>
             </w:tcBorders>
+            <w:tcMar>
+              <w:top w:w="30" w:type="dxa"/>
+              <w:bottom w:w="30" w:type="dxa"/>
+              <w:left w:w="30" w:type="dxa"/>
+              <w:right w:w="30" w:type="dxa"/>
+            </w:tcMar>
             <w:shd w:fill="FFFFFF"/>
           </w:tcPr>
           <w:p>
@@ -889,13 +1065,19 @@
         </w:tc>
         <w:tc>
           <w:tcPr>
-            <w:tcW w:type="dxa" w:w="899"/>
+            <w:tcW w:type="dxa" w:w="864"/>
             <w:tcBorders>
               <w:top w:val="single" w:sz="4" w:space="0" w:color="auto"/>
               <w:bottom w:val="single" w:sz="4" w:space="0" w:color="auto"/>
               <w:left w:val="single" w:sz="4" w:space="0" w:color="auto"/>
               <w:right w:val="single" w:sz="4" w:space="0" w:color="auto"/>
             </w:tcBorders>
+            <w:tcMar>
+              <w:top w:w="30" w:type="dxa"/>
+              <w:bottom w:w="30" w:type="dxa"/>
+              <w:left w:w="30" w:type="dxa"/>
+              <w:right w:w="30" w:type="dxa"/>
+            </w:tcMar>
             <w:shd w:fill="FFFFFF"/>
           </w:tcPr>
           <w:p>
@@ -916,13 +1098,19 @@
         </w:tc>
         <w:tc>
           <w:tcPr>
-            <w:tcW w:type="dxa" w:w="1096"/>
+            <w:tcW w:type="dxa" w:w="1152"/>
             <w:tcBorders>
               <w:top w:val="single" w:sz="4" w:space="0" w:color="auto"/>
               <w:bottom w:val="single" w:sz="4" w:space="0" w:color="auto"/>
               <w:left w:val="single" w:sz="4" w:space="0" w:color="auto"/>
               <w:right w:val="single" w:sz="4" w:space="0" w:color="auto"/>
             </w:tcBorders>
+            <w:tcMar>
+              <w:top w:w="30" w:type="dxa"/>
+              <w:bottom w:w="30" w:type="dxa"/>
+              <w:left w:w="30" w:type="dxa"/>
+              <w:right w:w="30" w:type="dxa"/>
+            </w:tcMar>
             <w:shd w:fill="FFFFFF"/>
           </w:tcPr>
           <w:p>
@@ -943,13 +1131,19 @@
         </w:tc>
         <w:tc>
           <w:tcPr>
-            <w:tcW w:type="dxa" w:w="1349"/>
+            <w:tcW w:type="dxa" w:w="1296"/>
             <w:tcBorders>
               <w:top w:val="single" w:sz="4" w:space="0" w:color="auto"/>
               <w:bottom w:val="single" w:sz="4" w:space="0" w:color="auto"/>
               <w:left w:val="single" w:sz="4" w:space="0" w:color="auto"/>
               <w:right w:val="single" w:sz="4" w:space="0" w:color="auto"/>
             </w:tcBorders>
+            <w:tcMar>
+              <w:top w:w="30" w:type="dxa"/>
+              <w:bottom w:w="30" w:type="dxa"/>
+              <w:left w:w="30" w:type="dxa"/>
+              <w:right w:w="30" w:type="dxa"/>
+            </w:tcMar>
             <w:shd w:fill="FFFFFF"/>
           </w:tcPr>
           <w:p>
@@ -970,13 +1164,19 @@
         </w:tc>
         <w:tc>
           <w:tcPr>
-            <w:tcW w:type="dxa" w:w="1298"/>
+            <w:tcW w:type="dxa" w:w="1368"/>
             <w:tcBorders>
               <w:top w:val="single" w:sz="4" w:space="0" w:color="auto"/>
               <w:bottom w:val="single" w:sz="4" w:space="0" w:color="auto"/>
               <w:left w:val="single" w:sz="4" w:space="0" w:color="auto"/>
               <w:right w:val="single" w:sz="4" w:space="0" w:color="auto"/>
             </w:tcBorders>
+            <w:tcMar>
+              <w:top w:w="30" w:type="dxa"/>
+              <w:bottom w:w="30" w:type="dxa"/>
+              <w:left w:w="30" w:type="dxa"/>
+              <w:right w:w="30" w:type="dxa"/>
+            </w:tcMar>
             <w:shd w:fill="FFFFFF"/>
           </w:tcPr>
           <w:p>
@@ -997,13 +1197,19 @@
         </w:tc>
         <w:tc>
           <w:tcPr>
-            <w:tcW w:type="dxa" w:w="1037"/>
+            <w:tcW w:type="dxa" w:w="1224"/>
             <w:tcBorders>
               <w:top w:val="single" w:sz="4" w:space="0" w:color="auto"/>
               <w:bottom w:val="single" w:sz="4" w:space="0" w:color="auto"/>
               <w:left w:val="single" w:sz="4" w:space="0" w:color="auto"/>
               <w:right w:val="single" w:sz="4" w:space="0" w:color="auto"/>
             </w:tcBorders>
+            <w:tcMar>
+              <w:top w:w="30" w:type="dxa"/>
+              <w:bottom w:w="30" w:type="dxa"/>
+              <w:left w:w="30" w:type="dxa"/>
+              <w:right w:w="30" w:type="dxa"/>
+            </w:tcMar>
             <w:shd w:fill="FFFFFF"/>
           </w:tcPr>
           <w:p>
@@ -1024,13 +1230,19 @@
         </w:tc>
         <w:tc>
           <w:tcPr>
-            <w:tcW w:type="dxa" w:w="608"/>
+            <w:tcW w:type="dxa" w:w="648"/>
             <w:tcBorders>
               <w:top w:val="single" w:sz="4" w:space="0" w:color="auto"/>
               <w:bottom w:val="single" w:sz="4" w:space="0" w:color="auto"/>
               <w:left w:val="single" w:sz="4" w:space="0" w:color="auto"/>
               <w:right w:val="single" w:sz="4" w:space="0" w:color="auto"/>
             </w:tcBorders>
+            <w:tcMar>
+              <w:top w:w="30" w:type="dxa"/>
+              <w:bottom w:w="30" w:type="dxa"/>
+              <w:left w:w="30" w:type="dxa"/>
+              <w:right w:w="30" w:type="dxa"/>
+            </w:tcMar>
             <w:shd w:fill="FFFFFF"/>
           </w:tcPr>
           <w:p>
@@ -1053,13 +1265,19 @@
       <w:tr>
         <w:tc>
           <w:tcPr>
-            <w:tcW w:type="dxa" w:w="1602"/>
+            <w:tcW w:type="dxa" w:w="1656"/>
             <w:tcBorders>
               <w:top w:val="single" w:sz="4" w:space="0" w:color="auto"/>
               <w:bottom w:val="single" w:sz="4" w:space="0" w:color="auto"/>
               <w:left w:val="single" w:sz="4" w:space="0" w:color="auto"/>
               <w:right w:val="single" w:sz="4" w:space="0" w:color="auto"/>
             </w:tcBorders>
+            <w:tcMar>
+              <w:top w:w="30" w:type="dxa"/>
+              <w:bottom w:w="30" w:type="dxa"/>
+              <w:left w:w="30" w:type="dxa"/>
+              <w:right w:w="30" w:type="dxa"/>
+            </w:tcMar>
             <w:shd w:fill="FFFFFF"/>
           </w:tcPr>
           <w:p>
@@ -1080,13 +1298,19 @@
         </w:tc>
         <w:tc>
           <w:tcPr>
-            <w:tcW w:type="dxa" w:w="759"/>
+            <w:tcW w:type="dxa" w:w="936"/>
             <w:tcBorders>
               <w:top w:val="single" w:sz="4" w:space="0" w:color="auto"/>
               <w:bottom w:val="single" w:sz="4" w:space="0" w:color="auto"/>
               <w:left w:val="single" w:sz="4" w:space="0" w:color="auto"/>
               <w:right w:val="single" w:sz="4" w:space="0" w:color="auto"/>
             </w:tcBorders>
+            <w:tcMar>
+              <w:top w:w="30" w:type="dxa"/>
+              <w:bottom w:w="30" w:type="dxa"/>
+              <w:left w:w="30" w:type="dxa"/>
+              <w:right w:w="30" w:type="dxa"/>
+            </w:tcMar>
             <w:shd w:fill="FFFFFF"/>
           </w:tcPr>
           <w:p>
@@ -1107,13 +1331,19 @@
         </w:tc>
         <w:tc>
           <w:tcPr>
-            <w:tcW w:type="dxa" w:w="815"/>
+            <w:tcW w:type="dxa" w:w="936"/>
             <w:tcBorders>
               <w:top w:val="single" w:sz="4" w:space="0" w:color="auto"/>
               <w:bottom w:val="single" w:sz="4" w:space="0" w:color="auto"/>
               <w:left w:val="single" w:sz="4" w:space="0" w:color="auto"/>
               <w:right w:val="single" w:sz="4" w:space="0" w:color="auto"/>
             </w:tcBorders>
+            <w:tcMar>
+              <w:top w:w="30" w:type="dxa"/>
+              <w:bottom w:w="30" w:type="dxa"/>
+              <w:left w:w="30" w:type="dxa"/>
+              <w:right w:w="30" w:type="dxa"/>
+            </w:tcMar>
             <w:shd w:fill="FFFFFF"/>
           </w:tcPr>
           <w:p>
@@ -1134,13 +1364,19 @@
         </w:tc>
         <w:tc>
           <w:tcPr>
-            <w:tcW w:type="dxa" w:w="899"/>
+            <w:tcW w:type="dxa" w:w="864"/>
             <w:tcBorders>
               <w:top w:val="single" w:sz="4" w:space="0" w:color="auto"/>
               <w:bottom w:val="single" w:sz="4" w:space="0" w:color="auto"/>
               <w:left w:val="single" w:sz="4" w:space="0" w:color="auto"/>
               <w:right w:val="single" w:sz="4" w:space="0" w:color="auto"/>
             </w:tcBorders>
+            <w:tcMar>
+              <w:top w:w="30" w:type="dxa"/>
+              <w:bottom w:w="30" w:type="dxa"/>
+              <w:left w:w="30" w:type="dxa"/>
+              <w:right w:w="30" w:type="dxa"/>
+            </w:tcMar>
             <w:shd w:fill="FFFFFF"/>
           </w:tcPr>
           <w:p>
@@ -1161,13 +1397,19 @@
         </w:tc>
         <w:tc>
           <w:tcPr>
-            <w:tcW w:type="dxa" w:w="1096"/>
+            <w:tcW w:type="dxa" w:w="1152"/>
             <w:tcBorders>
               <w:top w:val="single" w:sz="4" w:space="0" w:color="auto"/>
               <w:bottom w:val="single" w:sz="4" w:space="0" w:color="auto"/>
               <w:left w:val="single" w:sz="4" w:space="0" w:color="auto"/>
               <w:right w:val="single" w:sz="4" w:space="0" w:color="auto"/>
             </w:tcBorders>
+            <w:tcMar>
+              <w:top w:w="30" w:type="dxa"/>
+              <w:bottom w:w="30" w:type="dxa"/>
+              <w:left w:w="30" w:type="dxa"/>
+              <w:right w:w="30" w:type="dxa"/>
+            </w:tcMar>
             <w:shd w:fill="FFFFFF"/>
           </w:tcPr>
           <w:p>
@@ -1188,13 +1430,19 @@
         </w:tc>
         <w:tc>
           <w:tcPr>
-            <w:tcW w:type="dxa" w:w="1349"/>
+            <w:tcW w:type="dxa" w:w="1296"/>
             <w:tcBorders>
               <w:top w:val="single" w:sz="4" w:space="0" w:color="auto"/>
               <w:bottom w:val="single" w:sz="4" w:space="0" w:color="auto"/>
               <w:left w:val="single" w:sz="4" w:space="0" w:color="auto"/>
               <w:right w:val="single" w:sz="4" w:space="0" w:color="auto"/>
             </w:tcBorders>
+            <w:tcMar>
+              <w:top w:w="30" w:type="dxa"/>
+              <w:bottom w:w="30" w:type="dxa"/>
+              <w:left w:w="30" w:type="dxa"/>
+              <w:right w:w="30" w:type="dxa"/>
+            </w:tcMar>
             <w:shd w:fill="FFFFFF"/>
           </w:tcPr>
           <w:p>
@@ -1215,13 +1463,19 @@
         </w:tc>
         <w:tc>
           <w:tcPr>
-            <w:tcW w:type="dxa" w:w="1298"/>
+            <w:tcW w:type="dxa" w:w="1368"/>
             <w:tcBorders>
               <w:top w:val="single" w:sz="4" w:space="0" w:color="auto"/>
               <w:bottom w:val="single" w:sz="4" w:space="0" w:color="auto"/>
               <w:left w:val="single" w:sz="4" w:space="0" w:color="auto"/>
               <w:right w:val="single" w:sz="4" w:space="0" w:color="auto"/>
             </w:tcBorders>
+            <w:tcMar>
+              <w:top w:w="30" w:type="dxa"/>
+              <w:bottom w:w="30" w:type="dxa"/>
+              <w:left w:w="30" w:type="dxa"/>
+              <w:right w:w="30" w:type="dxa"/>
+            </w:tcMar>
             <w:shd w:fill="FFFFFF"/>
           </w:tcPr>
           <w:p>
@@ -1242,13 +1496,19 @@
         </w:tc>
         <w:tc>
           <w:tcPr>
-            <w:tcW w:type="dxa" w:w="1037"/>
+            <w:tcW w:type="dxa" w:w="1224"/>
             <w:tcBorders>
               <w:top w:val="single" w:sz="4" w:space="0" w:color="auto"/>
               <w:bottom w:val="single" w:sz="4" w:space="0" w:color="auto"/>
               <w:left w:val="single" w:sz="4" w:space="0" w:color="auto"/>
               <w:right w:val="single" w:sz="4" w:space="0" w:color="auto"/>
             </w:tcBorders>
+            <w:tcMar>
+              <w:top w:w="30" w:type="dxa"/>
+              <w:bottom w:w="30" w:type="dxa"/>
+              <w:left w:w="30" w:type="dxa"/>
+              <w:right w:w="30" w:type="dxa"/>
+            </w:tcMar>
             <w:shd w:fill="FFFFFF"/>
           </w:tcPr>
           <w:p>
@@ -1269,13 +1529,19 @@
         </w:tc>
         <w:tc>
           <w:tcPr>
-            <w:tcW w:type="dxa" w:w="608"/>
+            <w:tcW w:type="dxa" w:w="648"/>
             <w:tcBorders>
               <w:top w:val="single" w:sz="4" w:space="0" w:color="auto"/>
               <w:bottom w:val="single" w:sz="4" w:space="0" w:color="auto"/>
               <w:left w:val="single" w:sz="4" w:space="0" w:color="auto"/>
               <w:right w:val="single" w:sz="4" w:space="0" w:color="auto"/>
             </w:tcBorders>
+            <w:tcMar>
+              <w:top w:w="30" w:type="dxa"/>
+              <w:bottom w:w="30" w:type="dxa"/>
+              <w:left w:w="30" w:type="dxa"/>
+              <w:right w:w="30" w:type="dxa"/>
+            </w:tcMar>
             <w:shd w:fill="FFFFFF"/>
           </w:tcPr>
           <w:p>
@@ -1298,13 +1564,19 @@
       <w:tr>
         <w:tc>
           <w:tcPr>
-            <w:tcW w:type="dxa" w:w="1602"/>
+            <w:tcW w:type="dxa" w:w="1656"/>
             <w:tcBorders>
               <w:top w:val="single" w:sz="4" w:space="0" w:color="auto"/>
               <w:bottom w:val="single" w:sz="4" w:space="0" w:color="auto"/>
               <w:left w:val="single" w:sz="4" w:space="0" w:color="auto"/>
               <w:right w:val="single" w:sz="4" w:space="0" w:color="auto"/>
             </w:tcBorders>
+            <w:tcMar>
+              <w:top w:w="30" w:type="dxa"/>
+              <w:bottom w:w="30" w:type="dxa"/>
+              <w:left w:w="30" w:type="dxa"/>
+              <w:right w:w="30" w:type="dxa"/>
+            </w:tcMar>
             <w:shd w:fill="FFFFFF"/>
           </w:tcPr>
           <w:p>
@@ -1325,13 +1597,19 @@
         </w:tc>
         <w:tc>
           <w:tcPr>
-            <w:tcW w:type="dxa" w:w="759"/>
+            <w:tcW w:type="dxa" w:w="936"/>
             <w:tcBorders>
               <w:top w:val="single" w:sz="4" w:space="0" w:color="auto"/>
               <w:bottom w:val="single" w:sz="4" w:space="0" w:color="auto"/>
               <w:left w:val="single" w:sz="4" w:space="0" w:color="auto"/>
               <w:right w:val="single" w:sz="4" w:space="0" w:color="auto"/>
             </w:tcBorders>
+            <w:tcMar>
+              <w:top w:w="30" w:type="dxa"/>
+              <w:bottom w:w="30" w:type="dxa"/>
+              <w:left w:w="30" w:type="dxa"/>
+              <w:right w:w="30" w:type="dxa"/>
+            </w:tcMar>
             <w:shd w:fill="FFFFFF"/>
           </w:tcPr>
           <w:p>
@@ -1352,13 +1630,19 @@
         </w:tc>
         <w:tc>
           <w:tcPr>
-            <w:tcW w:type="dxa" w:w="815"/>
+            <w:tcW w:type="dxa" w:w="936"/>
             <w:tcBorders>
               <w:top w:val="single" w:sz="4" w:space="0" w:color="auto"/>
               <w:bottom w:val="single" w:sz="4" w:space="0" w:color="auto"/>
               <w:left w:val="single" w:sz="4" w:space="0" w:color="auto"/>
               <w:right w:val="single" w:sz="4" w:space="0" w:color="auto"/>
             </w:tcBorders>
+            <w:tcMar>
+              <w:top w:w="30" w:type="dxa"/>
+              <w:bottom w:w="30" w:type="dxa"/>
+              <w:left w:w="30" w:type="dxa"/>
+              <w:right w:w="30" w:type="dxa"/>
+            </w:tcMar>
             <w:shd w:fill="FFFFFF"/>
           </w:tcPr>
           <w:p>
@@ -1379,13 +1663,19 @@
         </w:tc>
         <w:tc>
           <w:tcPr>
-            <w:tcW w:type="dxa" w:w="899"/>
+            <w:tcW w:type="dxa" w:w="864"/>
             <w:tcBorders>
               <w:top w:val="single" w:sz="4" w:space="0" w:color="auto"/>
               <w:bottom w:val="single" w:sz="4" w:space="0" w:color="auto"/>
               <w:left w:val="single" w:sz="4" w:space="0" w:color="auto"/>
               <w:right w:val="single" w:sz="4" w:space="0" w:color="auto"/>
             </w:tcBorders>
+            <w:tcMar>
+              <w:top w:w="30" w:type="dxa"/>
+              <w:bottom w:w="30" w:type="dxa"/>
+              <w:left w:w="30" w:type="dxa"/>
+              <w:right w:w="30" w:type="dxa"/>
+            </w:tcMar>
             <w:shd w:fill="FFFFFF"/>
           </w:tcPr>
           <w:p>
@@ -1406,13 +1696,19 @@
         </w:tc>
         <w:tc>
           <w:tcPr>
-            <w:tcW w:type="dxa" w:w="1096"/>
+            <w:tcW w:type="dxa" w:w="1152"/>
             <w:tcBorders>
               <w:top w:val="single" w:sz="4" w:space="0" w:color="auto"/>
               <w:bottom w:val="single" w:sz="4" w:space="0" w:color="auto"/>
               <w:left w:val="single" w:sz="4" w:space="0" w:color="auto"/>
               <w:right w:val="single" w:sz="4" w:space="0" w:color="auto"/>
             </w:tcBorders>
+            <w:tcMar>
+              <w:top w:w="30" w:type="dxa"/>
+              <w:bottom w:w="30" w:type="dxa"/>
+              <w:left w:w="30" w:type="dxa"/>
+              <w:right w:w="30" w:type="dxa"/>
+            </w:tcMar>
             <w:shd w:fill="FFFFFF"/>
           </w:tcPr>
           <w:p>
@@ -1433,13 +1729,19 @@
         </w:tc>
         <w:tc>
           <w:tcPr>
-            <w:tcW w:type="dxa" w:w="1349"/>
+            <w:tcW w:type="dxa" w:w="1296"/>
             <w:tcBorders>
               <w:top w:val="single" w:sz="4" w:space="0" w:color="auto"/>
               <w:bottom w:val="single" w:sz="4" w:space="0" w:color="auto"/>
               <w:left w:val="single" w:sz="4" w:space="0" w:color="auto"/>
               <w:right w:val="single" w:sz="4" w:space="0" w:color="auto"/>
             </w:tcBorders>
+            <w:tcMar>
+              <w:top w:w="30" w:type="dxa"/>
+              <w:bottom w:w="30" w:type="dxa"/>
+              <w:left w:w="30" w:type="dxa"/>
+              <w:right w:w="30" w:type="dxa"/>
+            </w:tcMar>
             <w:shd w:fill="FFFFFF"/>
           </w:tcPr>
           <w:p>
@@ -1460,13 +1762,19 @@
         </w:tc>
         <w:tc>
           <w:tcPr>
-            <w:tcW w:type="dxa" w:w="1298"/>
+            <w:tcW w:type="dxa" w:w="1368"/>
             <w:tcBorders>
               <w:top w:val="single" w:sz="4" w:space="0" w:color="auto"/>
               <w:bottom w:val="single" w:sz="4" w:space="0" w:color="auto"/>
               <w:left w:val="single" w:sz="4" w:space="0" w:color="auto"/>
               <w:right w:val="single" w:sz="4" w:space="0" w:color="auto"/>
             </w:tcBorders>
+            <w:tcMar>
+              <w:top w:w="30" w:type="dxa"/>
+              <w:bottom w:w="30" w:type="dxa"/>
+              <w:left w:w="30" w:type="dxa"/>
+              <w:right w:w="30" w:type="dxa"/>
+            </w:tcMar>
             <w:shd w:fill="FFFFFF"/>
           </w:tcPr>
           <w:p>
@@ -1487,13 +1795,19 @@
         </w:tc>
         <w:tc>
           <w:tcPr>
-            <w:tcW w:type="dxa" w:w="1037"/>
+            <w:tcW w:type="dxa" w:w="1224"/>
             <w:tcBorders>
               <w:top w:val="single" w:sz="4" w:space="0" w:color="auto"/>
               <w:bottom w:val="single" w:sz="4" w:space="0" w:color="auto"/>
               <w:left w:val="single" w:sz="4" w:space="0" w:color="auto"/>
               <w:right w:val="single" w:sz="4" w:space="0" w:color="auto"/>
             </w:tcBorders>
+            <w:tcMar>
+              <w:top w:w="30" w:type="dxa"/>
+              <w:bottom w:w="30" w:type="dxa"/>
+              <w:left w:w="30" w:type="dxa"/>
+              <w:right w:w="30" w:type="dxa"/>
+            </w:tcMar>
             <w:shd w:fill="FFFFFF"/>
           </w:tcPr>
           <w:p>
@@ -1514,13 +1828,19 @@
         </w:tc>
         <w:tc>
           <w:tcPr>
-            <w:tcW w:type="dxa" w:w="608"/>
+            <w:tcW w:type="dxa" w:w="648"/>
             <w:tcBorders>
               <w:top w:val="single" w:sz="4" w:space="0" w:color="auto"/>
               <w:bottom w:val="single" w:sz="4" w:space="0" w:color="auto"/>
               <w:left w:val="single" w:sz="4" w:space="0" w:color="auto"/>
               <w:right w:val="single" w:sz="4" w:space="0" w:color="auto"/>
             </w:tcBorders>
+            <w:tcMar>
+              <w:top w:w="30" w:type="dxa"/>
+              <w:bottom w:w="30" w:type="dxa"/>
+              <w:left w:w="30" w:type="dxa"/>
+              <w:right w:w="30" w:type="dxa"/>
+            </w:tcMar>
             <w:shd w:fill="FFFFFF"/>
           </w:tcPr>
           <w:p>
@@ -1543,7 +1863,7 @@
       <w:tr>
         <w:tc>
           <w:tcPr>
-            <w:tcW w:type="dxa" w:w="9360"/>
+            <w:tcW w:type="dxa" w:w="10080"/>
             <w:gridSpan w:val="9"/>
             <w:shd w:fill="D9D9D9"/>
             <w:tcBorders>
@@ -1552,6 +1872,12 @@
               <w:left w:val="single" w:sz="4" w:space="0" w:color="auto"/>
               <w:right w:val="single" w:sz="4" w:space="0" w:color="auto"/>
             </w:tcBorders>
+            <w:tcMar>
+              <w:top w:w="30" w:type="dxa"/>
+              <w:bottom w:w="30" w:type="dxa"/>
+              <w:left w:w="30" w:type="dxa"/>
+              <w:right w:w="30" w:type="dxa"/>
+            </w:tcMar>
           </w:tcPr>
           <w:p>
             <w:pPr>
@@ -1573,13 +1899,19 @@
       <w:tr>
         <w:tc>
           <w:tcPr>
-            <w:tcW w:type="dxa" w:w="1602"/>
+            <w:tcW w:type="dxa" w:w="1656"/>
             <w:tcBorders>
               <w:top w:val="single" w:sz="4" w:space="0" w:color="auto"/>
               <w:bottom w:val="single" w:sz="4" w:space="0" w:color="auto"/>
               <w:left w:val="single" w:sz="4" w:space="0" w:color="auto"/>
               <w:right w:val="single" w:sz="4" w:space="0" w:color="auto"/>
             </w:tcBorders>
+            <w:tcMar>
+              <w:top w:w="30" w:type="dxa"/>
+              <w:bottom w:w="30" w:type="dxa"/>
+              <w:left w:w="30" w:type="dxa"/>
+              <w:right w:w="30" w:type="dxa"/>
+            </w:tcMar>
             <w:shd w:fill="FFFFFF"/>
           </w:tcPr>
           <w:p>
@@ -1600,13 +1932,19 @@
         </w:tc>
         <w:tc>
           <w:tcPr>
-            <w:tcW w:type="dxa" w:w="759"/>
+            <w:tcW w:type="dxa" w:w="936"/>
             <w:tcBorders>
               <w:top w:val="single" w:sz="4" w:space="0" w:color="auto"/>
               <w:bottom w:val="single" w:sz="4" w:space="0" w:color="auto"/>
               <w:left w:val="single" w:sz="4" w:space="0" w:color="auto"/>
               <w:right w:val="single" w:sz="4" w:space="0" w:color="auto"/>
             </w:tcBorders>
+            <w:tcMar>
+              <w:top w:w="30" w:type="dxa"/>
+              <w:bottom w:w="30" w:type="dxa"/>
+              <w:left w:w="30" w:type="dxa"/>
+              <w:right w:w="30" w:type="dxa"/>
+            </w:tcMar>
             <w:shd w:fill="FFFFFF"/>
           </w:tcPr>
           <w:p>
@@ -1627,13 +1965,19 @@
         </w:tc>
         <w:tc>
           <w:tcPr>
-            <w:tcW w:type="dxa" w:w="815"/>
+            <w:tcW w:type="dxa" w:w="936"/>
             <w:tcBorders>
               <w:top w:val="single" w:sz="4" w:space="0" w:color="auto"/>
               <w:bottom w:val="single" w:sz="4" w:space="0" w:color="auto"/>
               <w:left w:val="single" w:sz="4" w:space="0" w:color="auto"/>
               <w:right w:val="single" w:sz="4" w:space="0" w:color="auto"/>
             </w:tcBorders>
+            <w:tcMar>
+              <w:top w:w="30" w:type="dxa"/>
+              <w:bottom w:w="30" w:type="dxa"/>
+              <w:left w:w="30" w:type="dxa"/>
+              <w:right w:w="30" w:type="dxa"/>
+            </w:tcMar>
             <w:shd w:fill="FFFFFF"/>
           </w:tcPr>
           <w:p>
@@ -1654,13 +1998,19 @@
         </w:tc>
         <w:tc>
           <w:tcPr>
-            <w:tcW w:type="dxa" w:w="899"/>
+            <w:tcW w:type="dxa" w:w="864"/>
             <w:tcBorders>
               <w:top w:val="single" w:sz="4" w:space="0" w:color="auto"/>
               <w:bottom w:val="single" w:sz="4" w:space="0" w:color="auto"/>
               <w:left w:val="single" w:sz="4" w:space="0" w:color="auto"/>
               <w:right w:val="single" w:sz="4" w:space="0" w:color="auto"/>
             </w:tcBorders>
+            <w:tcMar>
+              <w:top w:w="30" w:type="dxa"/>
+              <w:bottom w:w="30" w:type="dxa"/>
+              <w:left w:w="30" w:type="dxa"/>
+              <w:right w:w="30" w:type="dxa"/>
+            </w:tcMar>
             <w:shd w:fill="FFFFFF"/>
           </w:tcPr>
           <w:p>
@@ -1681,13 +2031,19 @@
         </w:tc>
         <w:tc>
           <w:tcPr>
-            <w:tcW w:type="dxa" w:w="1096"/>
+            <w:tcW w:type="dxa" w:w="1152"/>
             <w:tcBorders>
               <w:top w:val="single" w:sz="4" w:space="0" w:color="auto"/>
               <w:bottom w:val="single" w:sz="4" w:space="0" w:color="auto"/>
               <w:left w:val="single" w:sz="4" w:space="0" w:color="auto"/>
               <w:right w:val="single" w:sz="4" w:space="0" w:color="auto"/>
             </w:tcBorders>
+            <w:tcMar>
+              <w:top w:w="30" w:type="dxa"/>
+              <w:bottom w:w="30" w:type="dxa"/>
+              <w:left w:w="30" w:type="dxa"/>
+              <w:right w:w="30" w:type="dxa"/>
+            </w:tcMar>
             <w:shd w:fill="FFFFFF"/>
           </w:tcPr>
           <w:p>
@@ -1708,13 +2064,19 @@
         </w:tc>
         <w:tc>
           <w:tcPr>
-            <w:tcW w:type="dxa" w:w="1349"/>
+            <w:tcW w:type="dxa" w:w="1296"/>
             <w:tcBorders>
               <w:top w:val="single" w:sz="4" w:space="0" w:color="auto"/>
               <w:bottom w:val="single" w:sz="4" w:space="0" w:color="auto"/>
               <w:left w:val="single" w:sz="4" w:space="0" w:color="auto"/>
               <w:right w:val="single" w:sz="4" w:space="0" w:color="auto"/>
             </w:tcBorders>
+            <w:tcMar>
+              <w:top w:w="30" w:type="dxa"/>
+              <w:bottom w:w="30" w:type="dxa"/>
+              <w:left w:w="30" w:type="dxa"/>
+              <w:right w:w="30" w:type="dxa"/>
+            </w:tcMar>
             <w:shd w:fill="FFFFFF"/>
           </w:tcPr>
           <w:p>
@@ -1735,13 +2097,19 @@
         </w:tc>
         <w:tc>
           <w:tcPr>
-            <w:tcW w:type="dxa" w:w="1298"/>
+            <w:tcW w:type="dxa" w:w="1368"/>
             <w:tcBorders>
               <w:top w:val="single" w:sz="4" w:space="0" w:color="auto"/>
               <w:bottom w:val="single" w:sz="4" w:space="0" w:color="auto"/>
               <w:left w:val="single" w:sz="4" w:space="0" w:color="auto"/>
               <w:right w:val="single" w:sz="4" w:space="0" w:color="auto"/>
             </w:tcBorders>
+            <w:tcMar>
+              <w:top w:w="30" w:type="dxa"/>
+              <w:bottom w:w="30" w:type="dxa"/>
+              <w:left w:w="30" w:type="dxa"/>
+              <w:right w:w="30" w:type="dxa"/>
+            </w:tcMar>
             <w:shd w:fill="FFFFFF"/>
           </w:tcPr>
           <w:p>
@@ -1761,13 +2129,19 @@
         </w:tc>
         <w:tc>
           <w:tcPr>
-            <w:tcW w:type="dxa" w:w="1037"/>
+            <w:tcW w:type="dxa" w:w="1224"/>
             <w:tcBorders>
               <w:top w:val="single" w:sz="4" w:space="0" w:color="auto"/>
               <w:bottom w:val="single" w:sz="4" w:space="0" w:color="auto"/>
               <w:left w:val="single" w:sz="4" w:space="0" w:color="auto"/>
               <w:right w:val="single" w:sz="4" w:space="0" w:color="auto"/>
             </w:tcBorders>
+            <w:tcMar>
+              <w:top w:w="30" w:type="dxa"/>
+              <w:bottom w:w="30" w:type="dxa"/>
+              <w:left w:w="30" w:type="dxa"/>
+              <w:right w:w="30" w:type="dxa"/>
+            </w:tcMar>
             <w:shd w:fill="FFFFFF"/>
           </w:tcPr>
           <w:p>
@@ -1787,13 +2161,19 @@
         </w:tc>
         <w:tc>
           <w:tcPr>
-            <w:tcW w:type="dxa" w:w="608"/>
+            <w:tcW w:type="dxa" w:w="648"/>
             <w:tcBorders>
               <w:top w:val="single" w:sz="4" w:space="0" w:color="auto"/>
               <w:bottom w:val="single" w:sz="4" w:space="0" w:color="auto"/>
               <w:left w:val="single" w:sz="4" w:space="0" w:color="auto"/>
               <w:right w:val="single" w:sz="4" w:space="0" w:color="auto"/>
             </w:tcBorders>
+            <w:tcMar>
+              <w:top w:w="30" w:type="dxa"/>
+              <w:bottom w:w="30" w:type="dxa"/>
+              <w:left w:w="30" w:type="dxa"/>
+              <w:right w:w="30" w:type="dxa"/>
+            </w:tcMar>
             <w:shd w:fill="FFFFFF"/>
           </w:tcPr>
           <w:p>
@@ -1816,13 +2196,19 @@
       <w:tr>
         <w:tc>
           <w:tcPr>
-            <w:tcW w:type="dxa" w:w="1602"/>
+            <w:tcW w:type="dxa" w:w="1656"/>
             <w:tcBorders>
               <w:top w:val="single" w:sz="4" w:space="0" w:color="auto"/>
               <w:bottom w:val="single" w:sz="4" w:space="0" w:color="auto"/>
               <w:left w:val="single" w:sz="4" w:space="0" w:color="auto"/>
               <w:right w:val="single" w:sz="4" w:space="0" w:color="auto"/>
             </w:tcBorders>
+            <w:tcMar>
+              <w:top w:w="30" w:type="dxa"/>
+              <w:bottom w:w="30" w:type="dxa"/>
+              <w:left w:w="30" w:type="dxa"/>
+              <w:right w:w="30" w:type="dxa"/>
+            </w:tcMar>
             <w:shd w:fill="FFFFFF"/>
           </w:tcPr>
           <w:p>
@@ -1845,13 +2231,19 @@
         </w:tc>
         <w:tc>
           <w:tcPr>
-            <w:tcW w:type="dxa" w:w="759"/>
+            <w:tcW w:type="dxa" w:w="936"/>
             <w:tcBorders>
               <w:top w:val="single" w:sz="4" w:space="0" w:color="auto"/>
               <w:bottom w:val="single" w:sz="4" w:space="0" w:color="auto"/>
               <w:left w:val="single" w:sz="4" w:space="0" w:color="auto"/>
               <w:right w:val="single" w:sz="4" w:space="0" w:color="auto"/>
             </w:tcBorders>
+            <w:tcMar>
+              <w:top w:w="30" w:type="dxa"/>
+              <w:bottom w:w="30" w:type="dxa"/>
+              <w:left w:w="30" w:type="dxa"/>
+              <w:right w:w="30" w:type="dxa"/>
+            </w:tcMar>
             <w:shd w:fill="FFFFFF"/>
           </w:tcPr>
           <w:p>
@@ -1872,13 +2264,19 @@
         </w:tc>
         <w:tc>
           <w:tcPr>
-            <w:tcW w:type="dxa" w:w="815"/>
+            <w:tcW w:type="dxa" w:w="936"/>
             <w:tcBorders>
               <w:top w:val="single" w:sz="4" w:space="0" w:color="auto"/>
               <w:bottom w:val="single" w:sz="4" w:space="0" w:color="auto"/>
               <w:left w:val="single" w:sz="4" w:space="0" w:color="auto"/>
               <w:right w:val="single" w:sz="4" w:space="0" w:color="auto"/>
             </w:tcBorders>
+            <w:tcMar>
+              <w:top w:w="30" w:type="dxa"/>
+              <w:bottom w:w="30" w:type="dxa"/>
+              <w:left w:w="30" w:type="dxa"/>
+              <w:right w:w="30" w:type="dxa"/>
+            </w:tcMar>
             <w:shd w:fill="FFFFFF"/>
           </w:tcPr>
           <w:p>
@@ -1899,13 +2297,19 @@
         </w:tc>
         <w:tc>
           <w:tcPr>
-            <w:tcW w:type="dxa" w:w="899"/>
+            <w:tcW w:type="dxa" w:w="864"/>
             <w:tcBorders>
               <w:top w:val="single" w:sz="4" w:space="0" w:color="auto"/>
               <w:bottom w:val="single" w:sz="4" w:space="0" w:color="auto"/>
               <w:left w:val="single" w:sz="4" w:space="0" w:color="auto"/>
               <w:right w:val="single" w:sz="4" w:space="0" w:color="auto"/>
             </w:tcBorders>
+            <w:tcMar>
+              <w:top w:w="30" w:type="dxa"/>
+              <w:bottom w:w="30" w:type="dxa"/>
+              <w:left w:w="30" w:type="dxa"/>
+              <w:right w:w="30" w:type="dxa"/>
+            </w:tcMar>
             <w:shd w:fill="FFFFFF"/>
           </w:tcPr>
           <w:p>
@@ -1926,13 +2330,19 @@
         </w:tc>
         <w:tc>
           <w:tcPr>
-            <w:tcW w:type="dxa" w:w="1096"/>
+            <w:tcW w:type="dxa" w:w="1152"/>
             <w:tcBorders>
               <w:top w:val="single" w:sz="4" w:space="0" w:color="auto"/>
               <w:bottom w:val="single" w:sz="4" w:space="0" w:color="auto"/>
               <w:left w:val="single" w:sz="4" w:space="0" w:color="auto"/>
               <w:right w:val="single" w:sz="4" w:space="0" w:color="auto"/>
             </w:tcBorders>
+            <w:tcMar>
+              <w:top w:w="30" w:type="dxa"/>
+              <w:bottom w:w="30" w:type="dxa"/>
+              <w:left w:w="30" w:type="dxa"/>
+              <w:right w:w="30" w:type="dxa"/>
+            </w:tcMar>
             <w:shd w:fill="FFFFFF"/>
           </w:tcPr>
           <w:p>
@@ -1953,13 +2363,19 @@
         </w:tc>
         <w:tc>
           <w:tcPr>
-            <w:tcW w:type="dxa" w:w="1349"/>
+            <w:tcW w:type="dxa" w:w="1296"/>
             <w:tcBorders>
               <w:top w:val="single" w:sz="4" w:space="0" w:color="auto"/>
               <w:bottom w:val="single" w:sz="4" w:space="0" w:color="auto"/>
               <w:left w:val="single" w:sz="4" w:space="0" w:color="auto"/>
               <w:right w:val="single" w:sz="4" w:space="0" w:color="auto"/>
             </w:tcBorders>
+            <w:tcMar>
+              <w:top w:w="30" w:type="dxa"/>
+              <w:bottom w:w="30" w:type="dxa"/>
+              <w:left w:w="30" w:type="dxa"/>
+              <w:right w:w="30" w:type="dxa"/>
+            </w:tcMar>
             <w:shd w:fill="FFFFFF"/>
           </w:tcPr>
           <w:p>
@@ -1980,13 +2396,19 @@
         </w:tc>
         <w:tc>
           <w:tcPr>
-            <w:tcW w:type="dxa" w:w="1298"/>
+            <w:tcW w:type="dxa" w:w="1368"/>
             <w:tcBorders>
               <w:top w:val="single" w:sz="4" w:space="0" w:color="auto"/>
               <w:bottom w:val="single" w:sz="4" w:space="0" w:color="auto"/>
               <w:left w:val="single" w:sz="4" w:space="0" w:color="auto"/>
               <w:right w:val="single" w:sz="4" w:space="0" w:color="auto"/>
             </w:tcBorders>
+            <w:tcMar>
+              <w:top w:w="30" w:type="dxa"/>
+              <w:bottom w:w="30" w:type="dxa"/>
+              <w:left w:w="30" w:type="dxa"/>
+              <w:right w:w="30" w:type="dxa"/>
+            </w:tcMar>
             <w:shd w:fill="FFFFFF"/>
           </w:tcPr>
           <w:p>
@@ -2007,13 +2429,19 @@
         </w:tc>
         <w:tc>
           <w:tcPr>
-            <w:tcW w:type="dxa" w:w="1037"/>
+            <w:tcW w:type="dxa" w:w="1224"/>
             <w:tcBorders>
               <w:top w:val="single" w:sz="4" w:space="0" w:color="auto"/>
               <w:bottom w:val="single" w:sz="4" w:space="0" w:color="auto"/>
               <w:left w:val="single" w:sz="4" w:space="0" w:color="auto"/>
               <w:right w:val="single" w:sz="4" w:space="0" w:color="auto"/>
             </w:tcBorders>
+            <w:tcMar>
+              <w:top w:w="30" w:type="dxa"/>
+              <w:bottom w:w="30" w:type="dxa"/>
+              <w:left w:w="30" w:type="dxa"/>
+              <w:right w:w="30" w:type="dxa"/>
+            </w:tcMar>
             <w:shd w:fill="FFFFFF"/>
           </w:tcPr>
           <w:p>
@@ -2034,13 +2462,19 @@
         </w:tc>
         <w:tc>
           <w:tcPr>
-            <w:tcW w:type="dxa" w:w="608"/>
+            <w:tcW w:type="dxa" w:w="648"/>
             <w:tcBorders>
               <w:top w:val="single" w:sz="4" w:space="0" w:color="auto"/>
               <w:bottom w:val="single" w:sz="4" w:space="0" w:color="auto"/>
               <w:left w:val="single" w:sz="4" w:space="0" w:color="auto"/>
               <w:right w:val="single" w:sz="4" w:space="0" w:color="auto"/>
             </w:tcBorders>
+            <w:tcMar>
+              <w:top w:w="30" w:type="dxa"/>
+              <w:bottom w:w="30" w:type="dxa"/>
+              <w:left w:w="30" w:type="dxa"/>
+              <w:right w:w="30" w:type="dxa"/>
+            </w:tcMar>
             <w:shd w:fill="FFFFFF"/>
           </w:tcPr>
           <w:p>
@@ -2063,13 +2497,19 @@
       <w:tr>
         <w:tc>
           <w:tcPr>
-            <w:tcW w:type="dxa" w:w="1602"/>
+            <w:tcW w:type="dxa" w:w="1656"/>
             <w:tcBorders>
               <w:top w:val="single" w:sz="4" w:space="0" w:color="auto"/>
               <w:bottom w:val="single" w:sz="4" w:space="0" w:color="auto"/>
               <w:left w:val="single" w:sz="4" w:space="0" w:color="auto"/>
               <w:right w:val="single" w:sz="4" w:space="0" w:color="auto"/>
             </w:tcBorders>
+            <w:tcMar>
+              <w:top w:w="30" w:type="dxa"/>
+              <w:bottom w:w="30" w:type="dxa"/>
+              <w:left w:w="30" w:type="dxa"/>
+              <w:right w:w="30" w:type="dxa"/>
+            </w:tcMar>
             <w:shd w:fill="FFFFFF"/>
           </w:tcPr>
           <w:p>
@@ -2090,13 +2530,19 @@
         </w:tc>
         <w:tc>
           <w:tcPr>
-            <w:tcW w:type="dxa" w:w="759"/>
+            <w:tcW w:type="dxa" w:w="936"/>
             <w:tcBorders>
               <w:top w:val="single" w:sz="4" w:space="0" w:color="auto"/>
               <w:bottom w:val="single" w:sz="4" w:space="0" w:color="auto"/>
               <w:left w:val="single" w:sz="4" w:space="0" w:color="auto"/>
               <w:right w:val="single" w:sz="4" w:space="0" w:color="auto"/>
             </w:tcBorders>
+            <w:tcMar>
+              <w:top w:w="30" w:type="dxa"/>
+              <w:bottom w:w="30" w:type="dxa"/>
+              <w:left w:w="30" w:type="dxa"/>
+              <w:right w:w="30" w:type="dxa"/>
+            </w:tcMar>
             <w:shd w:fill="FFFFFF"/>
           </w:tcPr>
           <w:p>
@@ -2117,13 +2563,19 @@
         </w:tc>
         <w:tc>
           <w:tcPr>
-            <w:tcW w:type="dxa" w:w="815"/>
+            <w:tcW w:type="dxa" w:w="936"/>
             <w:tcBorders>
               <w:top w:val="single" w:sz="4" w:space="0" w:color="auto"/>
               <w:bottom w:val="single" w:sz="4" w:space="0" w:color="auto"/>
               <w:left w:val="single" w:sz="4" w:space="0" w:color="auto"/>
               <w:right w:val="single" w:sz="4" w:space="0" w:color="auto"/>
             </w:tcBorders>
+            <w:tcMar>
+              <w:top w:w="30" w:type="dxa"/>
+              <w:bottom w:w="30" w:type="dxa"/>
+              <w:left w:w="30" w:type="dxa"/>
+              <w:right w:w="30" w:type="dxa"/>
+            </w:tcMar>
             <w:shd w:fill="FFFFFF"/>
           </w:tcPr>
           <w:p>
@@ -2144,13 +2596,19 @@
         </w:tc>
         <w:tc>
           <w:tcPr>
-            <w:tcW w:type="dxa" w:w="899"/>
+            <w:tcW w:type="dxa" w:w="864"/>
             <w:tcBorders>
               <w:top w:val="single" w:sz="4" w:space="0" w:color="auto"/>
               <w:bottom w:val="single" w:sz="4" w:space="0" w:color="auto"/>
               <w:left w:val="single" w:sz="4" w:space="0" w:color="auto"/>
               <w:right w:val="single" w:sz="4" w:space="0" w:color="auto"/>
             </w:tcBorders>
+            <w:tcMar>
+              <w:top w:w="30" w:type="dxa"/>
+              <w:bottom w:w="30" w:type="dxa"/>
+              <w:left w:w="30" w:type="dxa"/>
+              <w:right w:w="30" w:type="dxa"/>
+            </w:tcMar>
             <w:shd w:fill="FFFFFF"/>
           </w:tcPr>
           <w:p>
@@ -2171,13 +2629,19 @@
         </w:tc>
         <w:tc>
           <w:tcPr>
-            <w:tcW w:type="dxa" w:w="1096"/>
+            <w:tcW w:type="dxa" w:w="1152"/>
             <w:tcBorders>
               <w:top w:val="single" w:sz="4" w:space="0" w:color="auto"/>
               <w:bottom w:val="single" w:sz="4" w:space="0" w:color="auto"/>
               <w:left w:val="single" w:sz="4" w:space="0" w:color="auto"/>
               <w:right w:val="single" w:sz="4" w:space="0" w:color="auto"/>
             </w:tcBorders>
+            <w:tcMar>
+              <w:top w:w="30" w:type="dxa"/>
+              <w:bottom w:w="30" w:type="dxa"/>
+              <w:left w:w="30" w:type="dxa"/>
+              <w:right w:w="30" w:type="dxa"/>
+            </w:tcMar>
             <w:shd w:fill="FFFFFF"/>
           </w:tcPr>
           <w:p>
@@ -2198,13 +2662,19 @@
         </w:tc>
         <w:tc>
           <w:tcPr>
-            <w:tcW w:type="dxa" w:w="1349"/>
+            <w:tcW w:type="dxa" w:w="1296"/>
             <w:tcBorders>
               <w:top w:val="single" w:sz="4" w:space="0" w:color="auto"/>
               <w:bottom w:val="single" w:sz="4" w:space="0" w:color="auto"/>
               <w:left w:val="single" w:sz="4" w:space="0" w:color="auto"/>
               <w:right w:val="single" w:sz="4" w:space="0" w:color="auto"/>
             </w:tcBorders>
+            <w:tcMar>
+              <w:top w:w="30" w:type="dxa"/>
+              <w:bottom w:w="30" w:type="dxa"/>
+              <w:left w:w="30" w:type="dxa"/>
+              <w:right w:w="30" w:type="dxa"/>
+            </w:tcMar>
             <w:shd w:fill="FFFFFF"/>
           </w:tcPr>
           <w:p>
@@ -2225,13 +2695,19 @@
         </w:tc>
         <w:tc>
           <w:tcPr>
-            <w:tcW w:type="dxa" w:w="1298"/>
+            <w:tcW w:type="dxa" w:w="1368"/>
             <w:tcBorders>
               <w:top w:val="single" w:sz="4" w:space="0" w:color="auto"/>
               <w:bottom w:val="single" w:sz="4" w:space="0" w:color="auto"/>
               <w:left w:val="single" w:sz="4" w:space="0" w:color="auto"/>
               <w:right w:val="single" w:sz="4" w:space="0" w:color="auto"/>
             </w:tcBorders>
+            <w:tcMar>
+              <w:top w:w="30" w:type="dxa"/>
+              <w:bottom w:w="30" w:type="dxa"/>
+              <w:left w:w="30" w:type="dxa"/>
+              <w:right w:w="30" w:type="dxa"/>
+            </w:tcMar>
             <w:shd w:fill="FFFFFF"/>
           </w:tcPr>
           <w:p>
@@ -2252,13 +2728,19 @@
         </w:tc>
         <w:tc>
           <w:tcPr>
-            <w:tcW w:type="dxa" w:w="1037"/>
+            <w:tcW w:type="dxa" w:w="1224"/>
             <w:tcBorders>
               <w:top w:val="single" w:sz="4" w:space="0" w:color="auto"/>
               <w:bottom w:val="single" w:sz="4" w:space="0" w:color="auto"/>
               <w:left w:val="single" w:sz="4" w:space="0" w:color="auto"/>
               <w:right w:val="single" w:sz="4" w:space="0" w:color="auto"/>
             </w:tcBorders>
+            <w:tcMar>
+              <w:top w:w="30" w:type="dxa"/>
+              <w:bottom w:w="30" w:type="dxa"/>
+              <w:left w:w="30" w:type="dxa"/>
+              <w:right w:w="30" w:type="dxa"/>
+            </w:tcMar>
             <w:shd w:fill="FFFFFF"/>
           </w:tcPr>
           <w:p>
@@ -2279,13 +2761,19 @@
         </w:tc>
         <w:tc>
           <w:tcPr>
-            <w:tcW w:type="dxa" w:w="608"/>
+            <w:tcW w:type="dxa" w:w="648"/>
             <w:tcBorders>
               <w:top w:val="single" w:sz="4" w:space="0" w:color="auto"/>
               <w:bottom w:val="single" w:sz="4" w:space="0" w:color="auto"/>
               <w:left w:val="single" w:sz="4" w:space="0" w:color="auto"/>
               <w:right w:val="single" w:sz="4" w:space="0" w:color="auto"/>
             </w:tcBorders>
+            <w:tcMar>
+              <w:top w:w="30" w:type="dxa"/>
+              <w:bottom w:w="30" w:type="dxa"/>
+              <w:left w:w="30" w:type="dxa"/>
+              <w:right w:w="30" w:type="dxa"/>
+            </w:tcMar>
             <w:shd w:fill="FFFFFF"/>
           </w:tcPr>
           <w:p>
@@ -2308,13 +2796,19 @@
       <w:tr>
         <w:tc>
           <w:tcPr>
-            <w:tcW w:type="dxa" w:w="1602"/>
+            <w:tcW w:type="dxa" w:w="1656"/>
             <w:tcBorders>
               <w:top w:val="single" w:sz="4" w:space="0" w:color="auto"/>
               <w:bottom w:val="single" w:sz="4" w:space="0" w:color="auto"/>
               <w:left w:val="single" w:sz="4" w:space="0" w:color="auto"/>
               <w:right w:val="single" w:sz="4" w:space="0" w:color="auto"/>
             </w:tcBorders>
+            <w:tcMar>
+              <w:top w:w="30" w:type="dxa"/>
+              <w:bottom w:w="30" w:type="dxa"/>
+              <w:left w:w="30" w:type="dxa"/>
+              <w:right w:w="30" w:type="dxa"/>
+            </w:tcMar>
             <w:shd w:fill="FFFFFF"/>
           </w:tcPr>
           <w:p>
@@ -2335,13 +2829,19 @@
         </w:tc>
         <w:tc>
           <w:tcPr>
-            <w:tcW w:type="dxa" w:w="759"/>
+            <w:tcW w:type="dxa" w:w="936"/>
             <w:tcBorders>
               <w:top w:val="single" w:sz="4" w:space="0" w:color="auto"/>
               <w:bottom w:val="single" w:sz="4" w:space="0" w:color="auto"/>
               <w:left w:val="single" w:sz="4" w:space="0" w:color="auto"/>
               <w:right w:val="single" w:sz="4" w:space="0" w:color="auto"/>
             </w:tcBorders>
+            <w:tcMar>
+              <w:top w:w="30" w:type="dxa"/>
+              <w:bottom w:w="30" w:type="dxa"/>
+              <w:left w:w="30" w:type="dxa"/>
+              <w:right w:w="30" w:type="dxa"/>
+            </w:tcMar>
             <w:shd w:fill="FFFFFF"/>
           </w:tcPr>
           <w:p>
@@ -2362,13 +2862,19 @@
         </w:tc>
         <w:tc>
           <w:tcPr>
-            <w:tcW w:type="dxa" w:w="815"/>
+            <w:tcW w:type="dxa" w:w="936"/>
             <w:tcBorders>
               <w:top w:val="single" w:sz="4" w:space="0" w:color="auto"/>
               <w:bottom w:val="single" w:sz="4" w:space="0" w:color="auto"/>
               <w:left w:val="single" w:sz="4" w:space="0" w:color="auto"/>
               <w:right w:val="single" w:sz="4" w:space="0" w:color="auto"/>
             </w:tcBorders>
+            <w:tcMar>
+              <w:top w:w="30" w:type="dxa"/>
+              <w:bottom w:w="30" w:type="dxa"/>
+              <w:left w:w="30" w:type="dxa"/>
+              <w:right w:w="30" w:type="dxa"/>
+            </w:tcMar>
             <w:shd w:fill="FFFFFF"/>
           </w:tcPr>
           <w:p>
@@ -2389,13 +2895,19 @@
         </w:tc>
         <w:tc>
           <w:tcPr>
-            <w:tcW w:type="dxa" w:w="899"/>
+            <w:tcW w:type="dxa" w:w="864"/>
             <w:tcBorders>
               <w:top w:val="single" w:sz="4" w:space="0" w:color="auto"/>
               <w:bottom w:val="single" w:sz="4" w:space="0" w:color="auto"/>
               <w:left w:val="single" w:sz="4" w:space="0" w:color="auto"/>
               <w:right w:val="single" w:sz="4" w:space="0" w:color="auto"/>
             </w:tcBorders>
+            <w:tcMar>
+              <w:top w:w="30" w:type="dxa"/>
+              <w:bottom w:w="30" w:type="dxa"/>
+              <w:left w:w="30" w:type="dxa"/>
+              <w:right w:w="30" w:type="dxa"/>
+            </w:tcMar>
             <w:shd w:fill="FFFFFF"/>
           </w:tcPr>
           <w:p>
@@ -2416,13 +2928,19 @@
         </w:tc>
         <w:tc>
           <w:tcPr>
-            <w:tcW w:type="dxa" w:w="1096"/>
+            <w:tcW w:type="dxa" w:w="1152"/>
             <w:tcBorders>
               <w:top w:val="single" w:sz="4" w:space="0" w:color="auto"/>
               <w:bottom w:val="single" w:sz="4" w:space="0" w:color="auto"/>
               <w:left w:val="single" w:sz="4" w:space="0" w:color="auto"/>
               <w:right w:val="single" w:sz="4" w:space="0" w:color="auto"/>
             </w:tcBorders>
+            <w:tcMar>
+              <w:top w:w="30" w:type="dxa"/>
+              <w:bottom w:w="30" w:type="dxa"/>
+              <w:left w:w="30" w:type="dxa"/>
+              <w:right w:w="30" w:type="dxa"/>
+            </w:tcMar>
             <w:shd w:fill="FFFFFF"/>
           </w:tcPr>
           <w:p>
@@ -2443,13 +2961,19 @@
         </w:tc>
         <w:tc>
           <w:tcPr>
-            <w:tcW w:type="dxa" w:w="1349"/>
+            <w:tcW w:type="dxa" w:w="1296"/>
             <w:tcBorders>
               <w:top w:val="single" w:sz="4" w:space="0" w:color="auto"/>
               <w:bottom w:val="single" w:sz="4" w:space="0" w:color="auto"/>
               <w:left w:val="single" w:sz="4" w:space="0" w:color="auto"/>
               <w:right w:val="single" w:sz="4" w:space="0" w:color="auto"/>
             </w:tcBorders>
+            <w:tcMar>
+              <w:top w:w="30" w:type="dxa"/>
+              <w:bottom w:w="30" w:type="dxa"/>
+              <w:left w:w="30" w:type="dxa"/>
+              <w:right w:w="30" w:type="dxa"/>
+            </w:tcMar>
             <w:shd w:fill="FFFFFF"/>
           </w:tcPr>
           <w:p>
@@ -2470,13 +2994,19 @@
         </w:tc>
         <w:tc>
           <w:tcPr>
-            <w:tcW w:type="dxa" w:w="1298"/>
+            <w:tcW w:type="dxa" w:w="1368"/>
             <w:tcBorders>
               <w:top w:val="single" w:sz="4" w:space="0" w:color="auto"/>
               <w:bottom w:val="single" w:sz="4" w:space="0" w:color="auto"/>
               <w:left w:val="single" w:sz="4" w:space="0" w:color="auto"/>
               <w:right w:val="single" w:sz="4" w:space="0" w:color="auto"/>
             </w:tcBorders>
+            <w:tcMar>
+              <w:top w:w="30" w:type="dxa"/>
+              <w:bottom w:w="30" w:type="dxa"/>
+              <w:left w:w="30" w:type="dxa"/>
+              <w:right w:w="30" w:type="dxa"/>
+            </w:tcMar>
             <w:shd w:fill="FFFFFF"/>
           </w:tcPr>
           <w:p>
@@ -2497,13 +3027,19 @@
         </w:tc>
         <w:tc>
           <w:tcPr>
-            <w:tcW w:type="dxa" w:w="1037"/>
+            <w:tcW w:type="dxa" w:w="1224"/>
             <w:tcBorders>
               <w:top w:val="single" w:sz="4" w:space="0" w:color="auto"/>
               <w:bottom w:val="single" w:sz="4" w:space="0" w:color="auto"/>
               <w:left w:val="single" w:sz="4" w:space="0" w:color="auto"/>
               <w:right w:val="single" w:sz="4" w:space="0" w:color="auto"/>
             </w:tcBorders>
+            <w:tcMar>
+              <w:top w:w="30" w:type="dxa"/>
+              <w:bottom w:w="30" w:type="dxa"/>
+              <w:left w:w="30" w:type="dxa"/>
+              <w:right w:w="30" w:type="dxa"/>
+            </w:tcMar>
             <w:shd w:fill="FFFFFF"/>
           </w:tcPr>
           <w:p>
@@ -2524,13 +3060,19 @@
         </w:tc>
         <w:tc>
           <w:tcPr>
-            <w:tcW w:type="dxa" w:w="608"/>
+            <w:tcW w:type="dxa" w:w="648"/>
             <w:tcBorders>
               <w:top w:val="single" w:sz="4" w:space="0" w:color="auto"/>
               <w:bottom w:val="single" w:sz="4" w:space="0" w:color="auto"/>
               <w:left w:val="single" w:sz="4" w:space="0" w:color="auto"/>
               <w:right w:val="single" w:sz="4" w:space="0" w:color="auto"/>
             </w:tcBorders>
+            <w:tcMar>
+              <w:top w:w="30" w:type="dxa"/>
+              <w:bottom w:w="30" w:type="dxa"/>
+              <w:left w:w="30" w:type="dxa"/>
+              <w:right w:w="30" w:type="dxa"/>
+            </w:tcMar>
             <w:shd w:fill="FFFFFF"/>
           </w:tcPr>
           <w:p>
@@ -2553,13 +3095,19 @@
       <w:tr>
         <w:tc>
           <w:tcPr>
-            <w:tcW w:type="dxa" w:w="1602"/>
+            <w:tcW w:type="dxa" w:w="1656"/>
             <w:tcBorders>
               <w:top w:val="single" w:sz="4" w:space="0" w:color="auto"/>
               <w:bottom w:val="single" w:sz="4" w:space="0" w:color="auto"/>
               <w:left w:val="single" w:sz="4" w:space="0" w:color="auto"/>
               <w:right w:val="single" w:sz="4" w:space="0" w:color="auto"/>
             </w:tcBorders>
+            <w:tcMar>
+              <w:top w:w="30" w:type="dxa"/>
+              <w:bottom w:w="30" w:type="dxa"/>
+              <w:left w:w="30" w:type="dxa"/>
+              <w:right w:w="30" w:type="dxa"/>
+            </w:tcMar>
             <w:shd w:fill="FFFFFF"/>
           </w:tcPr>
           <w:p>
@@ -2580,13 +3128,19 @@
         </w:tc>
         <w:tc>
           <w:tcPr>
-            <w:tcW w:type="dxa" w:w="759"/>
+            <w:tcW w:type="dxa" w:w="936"/>
             <w:tcBorders>
               <w:top w:val="single" w:sz="4" w:space="0" w:color="auto"/>
               <w:bottom w:val="single" w:sz="4" w:space="0" w:color="auto"/>
               <w:left w:val="single" w:sz="4" w:space="0" w:color="auto"/>
               <w:right w:val="single" w:sz="4" w:space="0" w:color="auto"/>
             </w:tcBorders>
+            <w:tcMar>
+              <w:top w:w="30" w:type="dxa"/>
+              <w:bottom w:w="30" w:type="dxa"/>
+              <w:left w:w="30" w:type="dxa"/>
+              <w:right w:w="30" w:type="dxa"/>
+            </w:tcMar>
             <w:shd w:fill="FFFFFF"/>
           </w:tcPr>
           <w:p>
@@ -2607,13 +3161,19 @@
         </w:tc>
         <w:tc>
           <w:tcPr>
-            <w:tcW w:type="dxa" w:w="815"/>
+            <w:tcW w:type="dxa" w:w="936"/>
             <w:tcBorders>
               <w:top w:val="single" w:sz="4" w:space="0" w:color="auto"/>
               <w:bottom w:val="single" w:sz="4" w:space="0" w:color="auto"/>
               <w:left w:val="single" w:sz="4" w:space="0" w:color="auto"/>
               <w:right w:val="single" w:sz="4" w:space="0" w:color="auto"/>
             </w:tcBorders>
+            <w:tcMar>
+              <w:top w:w="30" w:type="dxa"/>
+              <w:bottom w:w="30" w:type="dxa"/>
+              <w:left w:w="30" w:type="dxa"/>
+              <w:right w:w="30" w:type="dxa"/>
+            </w:tcMar>
             <w:shd w:fill="FFFFFF"/>
           </w:tcPr>
           <w:p>
@@ -2634,13 +3194,19 @@
         </w:tc>
         <w:tc>
           <w:tcPr>
-            <w:tcW w:type="dxa" w:w="899"/>
+            <w:tcW w:type="dxa" w:w="864"/>
             <w:tcBorders>
               <w:top w:val="single" w:sz="4" w:space="0" w:color="auto"/>
               <w:bottom w:val="single" w:sz="4" w:space="0" w:color="auto"/>
               <w:left w:val="single" w:sz="4" w:space="0" w:color="auto"/>
               <w:right w:val="single" w:sz="4" w:space="0" w:color="auto"/>
             </w:tcBorders>
+            <w:tcMar>
+              <w:top w:w="30" w:type="dxa"/>
+              <w:bottom w:w="30" w:type="dxa"/>
+              <w:left w:w="30" w:type="dxa"/>
+              <w:right w:w="30" w:type="dxa"/>
+            </w:tcMar>
             <w:shd w:fill="FFFFFF"/>
           </w:tcPr>
           <w:p>
@@ -2661,13 +3227,19 @@
         </w:tc>
         <w:tc>
           <w:tcPr>
-            <w:tcW w:type="dxa" w:w="1096"/>
+            <w:tcW w:type="dxa" w:w="1152"/>
             <w:tcBorders>
               <w:top w:val="single" w:sz="4" w:space="0" w:color="auto"/>
               <w:bottom w:val="single" w:sz="4" w:space="0" w:color="auto"/>
               <w:left w:val="single" w:sz="4" w:space="0" w:color="auto"/>
               <w:right w:val="single" w:sz="4" w:space="0" w:color="auto"/>
             </w:tcBorders>
+            <w:tcMar>
+              <w:top w:w="30" w:type="dxa"/>
+              <w:bottom w:w="30" w:type="dxa"/>
+              <w:left w:w="30" w:type="dxa"/>
+              <w:right w:w="30" w:type="dxa"/>
+            </w:tcMar>
             <w:shd w:fill="FFFFFF"/>
           </w:tcPr>
           <w:p>
@@ -2688,13 +3260,19 @@
         </w:tc>
         <w:tc>
           <w:tcPr>
-            <w:tcW w:type="dxa" w:w="1349"/>
+            <w:tcW w:type="dxa" w:w="1296"/>
             <w:tcBorders>
               <w:top w:val="single" w:sz="4" w:space="0" w:color="auto"/>
               <w:bottom w:val="single" w:sz="4" w:space="0" w:color="auto"/>
               <w:left w:val="single" w:sz="4" w:space="0" w:color="auto"/>
               <w:right w:val="single" w:sz="4" w:space="0" w:color="auto"/>
             </w:tcBorders>
+            <w:tcMar>
+              <w:top w:w="30" w:type="dxa"/>
+              <w:bottom w:w="30" w:type="dxa"/>
+              <w:left w:w="30" w:type="dxa"/>
+              <w:right w:w="30" w:type="dxa"/>
+            </w:tcMar>
             <w:shd w:fill="FFFFFF"/>
           </w:tcPr>
           <w:p>
@@ -2715,13 +3293,19 @@
         </w:tc>
         <w:tc>
           <w:tcPr>
-            <w:tcW w:type="dxa" w:w="1298"/>
+            <w:tcW w:type="dxa" w:w="1368"/>
             <w:tcBorders>
               <w:top w:val="single" w:sz="4" w:space="0" w:color="auto"/>
               <w:bottom w:val="single" w:sz="4" w:space="0" w:color="auto"/>
               <w:left w:val="single" w:sz="4" w:space="0" w:color="auto"/>
               <w:right w:val="single" w:sz="4" w:space="0" w:color="auto"/>
             </w:tcBorders>
+            <w:tcMar>
+              <w:top w:w="30" w:type="dxa"/>
+              <w:bottom w:w="30" w:type="dxa"/>
+              <w:left w:w="30" w:type="dxa"/>
+              <w:right w:w="30" w:type="dxa"/>
+            </w:tcMar>
             <w:shd w:fill="FFFFFF"/>
           </w:tcPr>
           <w:p>
@@ -2742,13 +3326,19 @@
         </w:tc>
         <w:tc>
           <w:tcPr>
-            <w:tcW w:type="dxa" w:w="1037"/>
+            <w:tcW w:type="dxa" w:w="1224"/>
             <w:tcBorders>
               <w:top w:val="single" w:sz="4" w:space="0" w:color="auto"/>
               <w:bottom w:val="single" w:sz="4" w:space="0" w:color="auto"/>
               <w:left w:val="single" w:sz="4" w:space="0" w:color="auto"/>
               <w:right w:val="single" w:sz="4" w:space="0" w:color="auto"/>
             </w:tcBorders>
+            <w:tcMar>
+              <w:top w:w="30" w:type="dxa"/>
+              <w:bottom w:w="30" w:type="dxa"/>
+              <w:left w:w="30" w:type="dxa"/>
+              <w:right w:w="30" w:type="dxa"/>
+            </w:tcMar>
             <w:shd w:fill="FFFFFF"/>
           </w:tcPr>
           <w:p>
@@ -2769,13 +3359,19 @@
         </w:tc>
         <w:tc>
           <w:tcPr>
-            <w:tcW w:type="dxa" w:w="608"/>
+            <w:tcW w:type="dxa" w:w="648"/>
             <w:tcBorders>
               <w:top w:val="single" w:sz="4" w:space="0" w:color="auto"/>
               <w:bottom w:val="single" w:sz="4" w:space="0" w:color="auto"/>
               <w:left w:val="single" w:sz="4" w:space="0" w:color="auto"/>
               <w:right w:val="single" w:sz="4" w:space="0" w:color="auto"/>
             </w:tcBorders>
+            <w:tcMar>
+              <w:top w:w="30" w:type="dxa"/>
+              <w:bottom w:w="30" w:type="dxa"/>
+              <w:left w:w="30" w:type="dxa"/>
+              <w:right w:w="30" w:type="dxa"/>
+            </w:tcMar>
             <w:shd w:fill="FFFFFF"/>
           </w:tcPr>
           <w:p>
@@ -2798,13 +3394,19 @@
       <w:tr>
         <w:tc>
           <w:tcPr>
-            <w:tcW w:type="dxa" w:w="1602"/>
+            <w:tcW w:type="dxa" w:w="1656"/>
             <w:tcBorders>
               <w:top w:val="single" w:sz="4" w:space="0" w:color="auto"/>
               <w:bottom w:val="single" w:sz="4" w:space="0" w:color="auto"/>
               <w:left w:val="single" w:sz="4" w:space="0" w:color="auto"/>
               <w:right w:val="single" w:sz="4" w:space="0" w:color="auto"/>
             </w:tcBorders>
+            <w:tcMar>
+              <w:top w:w="30" w:type="dxa"/>
+              <w:bottom w:w="30" w:type="dxa"/>
+              <w:left w:w="30" w:type="dxa"/>
+              <w:right w:w="30" w:type="dxa"/>
+            </w:tcMar>
             <w:shd w:fill="FFFFFF"/>
           </w:tcPr>
           <w:p>
@@ -2825,13 +3427,19 @@
         </w:tc>
         <w:tc>
           <w:tcPr>
-            <w:tcW w:type="dxa" w:w="759"/>
+            <w:tcW w:type="dxa" w:w="936"/>
             <w:tcBorders>
               <w:top w:val="single" w:sz="4" w:space="0" w:color="auto"/>
               <w:bottom w:val="single" w:sz="4" w:space="0" w:color="auto"/>
               <w:left w:val="single" w:sz="4" w:space="0" w:color="auto"/>
               <w:right w:val="single" w:sz="4" w:space="0" w:color="auto"/>
             </w:tcBorders>
+            <w:tcMar>
+              <w:top w:w="30" w:type="dxa"/>
+              <w:bottom w:w="30" w:type="dxa"/>
+              <w:left w:w="30" w:type="dxa"/>
+              <w:right w:w="30" w:type="dxa"/>
+            </w:tcMar>
             <w:shd w:fill="FFFFFF"/>
           </w:tcPr>
           <w:p>
@@ -2852,13 +3460,19 @@
         </w:tc>
         <w:tc>
           <w:tcPr>
-            <w:tcW w:type="dxa" w:w="815"/>
+            <w:tcW w:type="dxa" w:w="936"/>
             <w:tcBorders>
               <w:top w:val="single" w:sz="4" w:space="0" w:color="auto"/>
               <w:bottom w:val="single" w:sz="4" w:space="0" w:color="auto"/>
               <w:left w:val="single" w:sz="4" w:space="0" w:color="auto"/>
               <w:right w:val="single" w:sz="4" w:space="0" w:color="auto"/>
             </w:tcBorders>
+            <w:tcMar>
+              <w:top w:w="30" w:type="dxa"/>
+              <w:bottom w:w="30" w:type="dxa"/>
+              <w:left w:w="30" w:type="dxa"/>
+              <w:right w:w="30" w:type="dxa"/>
+            </w:tcMar>
             <w:shd w:fill="FFFFFF"/>
           </w:tcPr>
           <w:p>
@@ -2879,13 +3493,19 @@
         </w:tc>
         <w:tc>
           <w:tcPr>
-            <w:tcW w:type="dxa" w:w="899"/>
+            <w:tcW w:type="dxa" w:w="864"/>
             <w:tcBorders>
               <w:top w:val="single" w:sz="4" w:space="0" w:color="auto"/>
               <w:bottom w:val="single" w:sz="4" w:space="0" w:color="auto"/>
               <w:left w:val="single" w:sz="4" w:space="0" w:color="auto"/>
               <w:right w:val="single" w:sz="4" w:space="0" w:color="auto"/>
             </w:tcBorders>
+            <w:tcMar>
+              <w:top w:w="30" w:type="dxa"/>
+              <w:bottom w:w="30" w:type="dxa"/>
+              <w:left w:w="30" w:type="dxa"/>
+              <w:right w:w="30" w:type="dxa"/>
+            </w:tcMar>
             <w:shd w:fill="FFFFFF"/>
           </w:tcPr>
           <w:p>
@@ -2906,13 +3526,19 @@
         </w:tc>
         <w:tc>
           <w:tcPr>
-            <w:tcW w:type="dxa" w:w="1096"/>
+            <w:tcW w:type="dxa" w:w="1152"/>
             <w:tcBorders>
               <w:top w:val="single" w:sz="4" w:space="0" w:color="auto"/>
               <w:bottom w:val="single" w:sz="4" w:space="0" w:color="auto"/>
               <w:left w:val="single" w:sz="4" w:space="0" w:color="auto"/>
               <w:right w:val="single" w:sz="4" w:space="0" w:color="auto"/>
             </w:tcBorders>
+            <w:tcMar>
+              <w:top w:w="30" w:type="dxa"/>
+              <w:bottom w:w="30" w:type="dxa"/>
+              <w:left w:w="30" w:type="dxa"/>
+              <w:right w:w="30" w:type="dxa"/>
+            </w:tcMar>
             <w:shd w:fill="FFFFFF"/>
           </w:tcPr>
           <w:p>
@@ -2933,13 +3559,19 @@
         </w:tc>
         <w:tc>
           <w:tcPr>
-            <w:tcW w:type="dxa" w:w="1349"/>
+            <w:tcW w:type="dxa" w:w="1296"/>
             <w:tcBorders>
               <w:top w:val="single" w:sz="4" w:space="0" w:color="auto"/>
               <w:bottom w:val="single" w:sz="4" w:space="0" w:color="auto"/>
               <w:left w:val="single" w:sz="4" w:space="0" w:color="auto"/>
               <w:right w:val="single" w:sz="4" w:space="0" w:color="auto"/>
             </w:tcBorders>
+            <w:tcMar>
+              <w:top w:w="30" w:type="dxa"/>
+              <w:bottom w:w="30" w:type="dxa"/>
+              <w:left w:w="30" w:type="dxa"/>
+              <w:right w:w="30" w:type="dxa"/>
+            </w:tcMar>
             <w:shd w:fill="FFFFFF"/>
           </w:tcPr>
           <w:p>
@@ -2960,13 +3592,19 @@
         </w:tc>
         <w:tc>
           <w:tcPr>
-            <w:tcW w:type="dxa" w:w="1298"/>
+            <w:tcW w:type="dxa" w:w="1368"/>
             <w:tcBorders>
               <w:top w:val="single" w:sz="4" w:space="0" w:color="auto"/>
               <w:bottom w:val="single" w:sz="4" w:space="0" w:color="auto"/>
               <w:left w:val="single" w:sz="4" w:space="0" w:color="auto"/>
               <w:right w:val="single" w:sz="4" w:space="0" w:color="auto"/>
             </w:tcBorders>
+            <w:tcMar>
+              <w:top w:w="30" w:type="dxa"/>
+              <w:bottom w:w="30" w:type="dxa"/>
+              <w:left w:w="30" w:type="dxa"/>
+              <w:right w:w="30" w:type="dxa"/>
+            </w:tcMar>
             <w:shd w:fill="FFFFFF"/>
           </w:tcPr>
           <w:p>
@@ -2987,13 +3625,19 @@
         </w:tc>
         <w:tc>
           <w:tcPr>
-            <w:tcW w:type="dxa" w:w="1037"/>
+            <w:tcW w:type="dxa" w:w="1224"/>
             <w:tcBorders>
               <w:top w:val="single" w:sz="4" w:space="0" w:color="auto"/>
               <w:bottom w:val="single" w:sz="4" w:space="0" w:color="auto"/>
               <w:left w:val="single" w:sz="4" w:space="0" w:color="auto"/>
               <w:right w:val="single" w:sz="4" w:space="0" w:color="auto"/>
             </w:tcBorders>
+            <w:tcMar>
+              <w:top w:w="30" w:type="dxa"/>
+              <w:bottom w:w="30" w:type="dxa"/>
+              <w:left w:w="30" w:type="dxa"/>
+              <w:right w:w="30" w:type="dxa"/>
+            </w:tcMar>
             <w:shd w:fill="FFFFFF"/>
           </w:tcPr>
           <w:p>
@@ -3014,13 +3658,19 @@
         </w:tc>
         <w:tc>
           <w:tcPr>
-            <w:tcW w:type="dxa" w:w="608"/>
+            <w:tcW w:type="dxa" w:w="648"/>
             <w:tcBorders>
               <w:top w:val="single" w:sz="4" w:space="0" w:color="auto"/>
               <w:bottom w:val="single" w:sz="4" w:space="0" w:color="auto"/>
               <w:left w:val="single" w:sz="4" w:space="0" w:color="auto"/>
               <w:right w:val="single" w:sz="4" w:space="0" w:color="auto"/>
             </w:tcBorders>
+            <w:tcMar>
+              <w:top w:w="30" w:type="dxa"/>
+              <w:bottom w:w="30" w:type="dxa"/>
+              <w:left w:w="30" w:type="dxa"/>
+              <w:right w:w="30" w:type="dxa"/>
+            </w:tcMar>
             <w:shd w:fill="FFFFFF"/>
           </w:tcPr>
           <w:p>
@@ -3043,7 +3693,7 @@
       <w:tr>
         <w:tc>
           <w:tcPr>
-            <w:tcW w:type="dxa" w:w="9360"/>
+            <w:tcW w:type="dxa" w:w="10080"/>
             <w:gridSpan w:val="9"/>
             <w:shd w:fill="D9D9D9"/>
             <w:tcBorders>
@@ -3052,6 +3702,12 @@
               <w:left w:val="single" w:sz="4" w:space="0" w:color="auto"/>
               <w:right w:val="single" w:sz="4" w:space="0" w:color="auto"/>
             </w:tcBorders>
+            <w:tcMar>
+              <w:top w:w="30" w:type="dxa"/>
+              <w:bottom w:w="30" w:type="dxa"/>
+              <w:left w:w="30" w:type="dxa"/>
+              <w:right w:w="30" w:type="dxa"/>
+            </w:tcMar>
           </w:tcPr>
           <w:p>
             <w:pPr>
@@ -3073,13 +3729,19 @@
       <w:tr>
         <w:tc>
           <w:tcPr>
-            <w:tcW w:type="dxa" w:w="1602"/>
+            <w:tcW w:type="dxa" w:w="1656"/>
             <w:tcBorders>
               <w:top w:val="single" w:sz="4" w:space="0" w:color="auto"/>
               <w:bottom w:val="single" w:sz="4" w:space="0" w:color="auto"/>
               <w:left w:val="single" w:sz="4" w:space="0" w:color="auto"/>
               <w:right w:val="single" w:sz="4" w:space="0" w:color="auto"/>
             </w:tcBorders>
+            <w:tcMar>
+              <w:top w:w="30" w:type="dxa"/>
+              <w:bottom w:w="30" w:type="dxa"/>
+              <w:left w:w="30" w:type="dxa"/>
+              <w:right w:w="30" w:type="dxa"/>
+            </w:tcMar>
             <w:shd w:fill="FFFFFF"/>
           </w:tcPr>
           <w:p>
@@ -3100,13 +3762,19 @@
         </w:tc>
         <w:tc>
           <w:tcPr>
-            <w:tcW w:type="dxa" w:w="759"/>
+            <w:tcW w:type="dxa" w:w="936"/>
             <w:tcBorders>
               <w:top w:val="single" w:sz="4" w:space="0" w:color="auto"/>
               <w:bottom w:val="single" w:sz="4" w:space="0" w:color="auto"/>
               <w:left w:val="single" w:sz="4" w:space="0" w:color="auto"/>
               <w:right w:val="single" w:sz="4" w:space="0" w:color="auto"/>
             </w:tcBorders>
+            <w:tcMar>
+              <w:top w:w="30" w:type="dxa"/>
+              <w:bottom w:w="30" w:type="dxa"/>
+              <w:left w:w="30" w:type="dxa"/>
+              <w:right w:w="30" w:type="dxa"/>
+            </w:tcMar>
             <w:shd w:fill="FFFFFF"/>
           </w:tcPr>
           <w:p>
@@ -3127,13 +3795,19 @@
         </w:tc>
         <w:tc>
           <w:tcPr>
-            <w:tcW w:type="dxa" w:w="815"/>
+            <w:tcW w:type="dxa" w:w="936"/>
             <w:tcBorders>
               <w:top w:val="single" w:sz="4" w:space="0" w:color="auto"/>
               <w:bottom w:val="single" w:sz="4" w:space="0" w:color="auto"/>
               <w:left w:val="single" w:sz="4" w:space="0" w:color="auto"/>
               <w:right w:val="single" w:sz="4" w:space="0" w:color="auto"/>
             </w:tcBorders>
+            <w:tcMar>
+              <w:top w:w="30" w:type="dxa"/>
+              <w:bottom w:w="30" w:type="dxa"/>
+              <w:left w:w="30" w:type="dxa"/>
+              <w:right w:w="30" w:type="dxa"/>
+            </w:tcMar>
             <w:shd w:fill="FFFFFF"/>
           </w:tcPr>
           <w:p>
@@ -3154,13 +3828,19 @@
         </w:tc>
         <w:tc>
           <w:tcPr>
-            <w:tcW w:type="dxa" w:w="899"/>
+            <w:tcW w:type="dxa" w:w="864"/>
             <w:tcBorders>
               <w:top w:val="single" w:sz="4" w:space="0" w:color="auto"/>
               <w:bottom w:val="single" w:sz="4" w:space="0" w:color="auto"/>
               <w:left w:val="single" w:sz="4" w:space="0" w:color="auto"/>
               <w:right w:val="single" w:sz="4" w:space="0" w:color="auto"/>
             </w:tcBorders>
+            <w:tcMar>
+              <w:top w:w="30" w:type="dxa"/>
+              <w:bottom w:w="30" w:type="dxa"/>
+              <w:left w:w="30" w:type="dxa"/>
+              <w:right w:w="30" w:type="dxa"/>
+            </w:tcMar>
             <w:shd w:fill="FFFFFF"/>
           </w:tcPr>
           <w:p>
@@ -3181,13 +3861,19 @@
         </w:tc>
         <w:tc>
           <w:tcPr>
-            <w:tcW w:type="dxa" w:w="1096"/>
+            <w:tcW w:type="dxa" w:w="1152"/>
             <w:tcBorders>
               <w:top w:val="single" w:sz="4" w:space="0" w:color="auto"/>
               <w:bottom w:val="single" w:sz="4" w:space="0" w:color="auto"/>
               <w:left w:val="single" w:sz="4" w:space="0" w:color="auto"/>
               <w:right w:val="single" w:sz="4" w:space="0" w:color="auto"/>
             </w:tcBorders>
+            <w:tcMar>
+              <w:top w:w="30" w:type="dxa"/>
+              <w:bottom w:w="30" w:type="dxa"/>
+              <w:left w:w="30" w:type="dxa"/>
+              <w:right w:w="30" w:type="dxa"/>
+            </w:tcMar>
             <w:shd w:fill="FFFFFF"/>
           </w:tcPr>
           <w:p>
@@ -3208,13 +3894,19 @@
         </w:tc>
         <w:tc>
           <w:tcPr>
-            <w:tcW w:type="dxa" w:w="1349"/>
+            <w:tcW w:type="dxa" w:w="1296"/>
             <w:tcBorders>
               <w:top w:val="single" w:sz="4" w:space="0" w:color="auto"/>
               <w:bottom w:val="single" w:sz="4" w:space="0" w:color="auto"/>
               <w:left w:val="single" w:sz="4" w:space="0" w:color="auto"/>
               <w:right w:val="single" w:sz="4" w:space="0" w:color="auto"/>
             </w:tcBorders>
+            <w:tcMar>
+              <w:top w:w="30" w:type="dxa"/>
+              <w:bottom w:w="30" w:type="dxa"/>
+              <w:left w:w="30" w:type="dxa"/>
+              <w:right w:w="30" w:type="dxa"/>
+            </w:tcMar>
             <w:shd w:fill="FFFFFF"/>
           </w:tcPr>
           <w:p>
@@ -3235,13 +3927,19 @@
         </w:tc>
         <w:tc>
           <w:tcPr>
-            <w:tcW w:type="dxa" w:w="1298"/>
+            <w:tcW w:type="dxa" w:w="1368"/>
             <w:tcBorders>
               <w:top w:val="single" w:sz="4" w:space="0" w:color="auto"/>
               <w:bottom w:val="single" w:sz="4" w:space="0" w:color="auto"/>
               <w:left w:val="single" w:sz="4" w:space="0" w:color="auto"/>
               <w:right w:val="single" w:sz="4" w:space="0" w:color="auto"/>
             </w:tcBorders>
+            <w:tcMar>
+              <w:top w:w="30" w:type="dxa"/>
+              <w:bottom w:w="30" w:type="dxa"/>
+              <w:left w:w="30" w:type="dxa"/>
+              <w:right w:w="30" w:type="dxa"/>
+            </w:tcMar>
             <w:shd w:fill="FFFFFF"/>
           </w:tcPr>
           <w:p>
@@ -3262,13 +3960,19 @@
         </w:tc>
         <w:tc>
           <w:tcPr>
-            <w:tcW w:type="dxa" w:w="1037"/>
+            <w:tcW w:type="dxa" w:w="1224"/>
             <w:tcBorders>
               <w:top w:val="single" w:sz="4" w:space="0" w:color="auto"/>
               <w:bottom w:val="single" w:sz="4" w:space="0" w:color="auto"/>
               <w:left w:val="single" w:sz="4" w:space="0" w:color="auto"/>
               <w:right w:val="single" w:sz="4" w:space="0" w:color="auto"/>
             </w:tcBorders>
+            <w:tcMar>
+              <w:top w:w="30" w:type="dxa"/>
+              <w:bottom w:w="30" w:type="dxa"/>
+              <w:left w:w="30" w:type="dxa"/>
+              <w:right w:w="30" w:type="dxa"/>
+            </w:tcMar>
             <w:shd w:fill="FFFFFF"/>
           </w:tcPr>
           <w:p>
@@ -3289,13 +3993,19 @@
         </w:tc>
         <w:tc>
           <w:tcPr>
-            <w:tcW w:type="dxa" w:w="608"/>
+            <w:tcW w:type="dxa" w:w="648"/>
             <w:tcBorders>
               <w:top w:val="single" w:sz="4" w:space="0" w:color="auto"/>
               <w:bottom w:val="single" w:sz="4" w:space="0" w:color="auto"/>
               <w:left w:val="single" w:sz="4" w:space="0" w:color="auto"/>
               <w:right w:val="single" w:sz="4" w:space="0" w:color="auto"/>
             </w:tcBorders>
+            <w:tcMar>
+              <w:top w:w="30" w:type="dxa"/>
+              <w:bottom w:w="30" w:type="dxa"/>
+              <w:left w:w="30" w:type="dxa"/>
+              <w:right w:w="30" w:type="dxa"/>
+            </w:tcMar>
             <w:shd w:fill="FFFFFF"/>
           </w:tcPr>
           <w:p>
@@ -3318,13 +4028,19 @@
       <w:tr>
         <w:tc>
           <w:tcPr>
-            <w:tcW w:type="dxa" w:w="1602"/>
+            <w:tcW w:type="dxa" w:w="1656"/>
             <w:tcBorders>
               <w:top w:val="single" w:sz="4" w:space="0" w:color="auto"/>
               <w:bottom w:val="single" w:sz="4" w:space="0" w:color="auto"/>
               <w:left w:val="single" w:sz="4" w:space="0" w:color="auto"/>
               <w:right w:val="single" w:sz="4" w:space="0" w:color="auto"/>
             </w:tcBorders>
+            <w:tcMar>
+              <w:top w:w="30" w:type="dxa"/>
+              <w:bottom w:w="30" w:type="dxa"/>
+              <w:left w:w="30" w:type="dxa"/>
+              <w:right w:w="30" w:type="dxa"/>
+            </w:tcMar>
             <w:shd w:fill="FFFFFF"/>
           </w:tcPr>
           <w:p>
@@ -3345,13 +4061,19 @@
         </w:tc>
         <w:tc>
           <w:tcPr>
-            <w:tcW w:type="dxa" w:w="759"/>
+            <w:tcW w:type="dxa" w:w="936"/>
             <w:tcBorders>
               <w:top w:val="single" w:sz="4" w:space="0" w:color="auto"/>
               <w:bottom w:val="single" w:sz="4" w:space="0" w:color="auto"/>
               <w:left w:val="single" w:sz="4" w:space="0" w:color="auto"/>
               <w:right w:val="single" w:sz="4" w:space="0" w:color="auto"/>
             </w:tcBorders>
+            <w:tcMar>
+              <w:top w:w="30" w:type="dxa"/>
+              <w:bottom w:w="30" w:type="dxa"/>
+              <w:left w:w="30" w:type="dxa"/>
+              <w:right w:w="30" w:type="dxa"/>
+            </w:tcMar>
             <w:shd w:fill="FFFFFF"/>
           </w:tcPr>
           <w:p>
@@ -3372,13 +4094,19 @@
         </w:tc>
         <w:tc>
           <w:tcPr>
-            <w:tcW w:type="dxa" w:w="815"/>
+            <w:tcW w:type="dxa" w:w="936"/>
             <w:tcBorders>
               <w:top w:val="single" w:sz="4" w:space="0" w:color="auto"/>
               <w:bottom w:val="single" w:sz="4" w:space="0" w:color="auto"/>
               <w:left w:val="single" w:sz="4" w:space="0" w:color="auto"/>
               <w:right w:val="single" w:sz="4" w:space="0" w:color="auto"/>
             </w:tcBorders>
+            <w:tcMar>
+              <w:top w:w="30" w:type="dxa"/>
+              <w:bottom w:w="30" w:type="dxa"/>
+              <w:left w:w="30" w:type="dxa"/>
+              <w:right w:w="30" w:type="dxa"/>
+            </w:tcMar>
             <w:shd w:fill="FFFFFF"/>
           </w:tcPr>
           <w:p>
@@ -3399,13 +4127,19 @@
         </w:tc>
         <w:tc>
           <w:tcPr>
-            <w:tcW w:type="dxa" w:w="899"/>
+            <w:tcW w:type="dxa" w:w="864"/>
             <w:tcBorders>
               <w:top w:val="single" w:sz="4" w:space="0" w:color="auto"/>
               <w:bottom w:val="single" w:sz="4" w:space="0" w:color="auto"/>
               <w:left w:val="single" w:sz="4" w:space="0" w:color="auto"/>
               <w:right w:val="single" w:sz="4" w:space="0" w:color="auto"/>
             </w:tcBorders>
+            <w:tcMar>
+              <w:top w:w="30" w:type="dxa"/>
+              <w:bottom w:w="30" w:type="dxa"/>
+              <w:left w:w="30" w:type="dxa"/>
+              <w:right w:w="30" w:type="dxa"/>
+            </w:tcMar>
             <w:shd w:fill="FFFFFF"/>
           </w:tcPr>
           <w:p>
@@ -3426,13 +4160,19 @@
         </w:tc>
         <w:tc>
           <w:tcPr>
-            <w:tcW w:type="dxa" w:w="1096"/>
+            <w:tcW w:type="dxa" w:w="1152"/>
             <w:tcBorders>
               <w:top w:val="single" w:sz="4" w:space="0" w:color="auto"/>
               <w:bottom w:val="single" w:sz="4" w:space="0" w:color="auto"/>
               <w:left w:val="single" w:sz="4" w:space="0" w:color="auto"/>
               <w:right w:val="single" w:sz="4" w:space="0" w:color="auto"/>
             </w:tcBorders>
+            <w:tcMar>
+              <w:top w:w="30" w:type="dxa"/>
+              <w:bottom w:w="30" w:type="dxa"/>
+              <w:left w:w="30" w:type="dxa"/>
+              <w:right w:w="30" w:type="dxa"/>
+            </w:tcMar>
             <w:shd w:fill="FFFFFF"/>
           </w:tcPr>
           <w:p>
@@ -3453,13 +4193,19 @@
         </w:tc>
         <w:tc>
           <w:tcPr>
-            <w:tcW w:type="dxa" w:w="1349"/>
+            <w:tcW w:type="dxa" w:w="1296"/>
             <w:tcBorders>
               <w:top w:val="single" w:sz="4" w:space="0" w:color="auto"/>
               <w:bottom w:val="single" w:sz="4" w:space="0" w:color="auto"/>
               <w:left w:val="single" w:sz="4" w:space="0" w:color="auto"/>
               <w:right w:val="single" w:sz="4" w:space="0" w:color="auto"/>
             </w:tcBorders>
+            <w:tcMar>
+              <w:top w:w="30" w:type="dxa"/>
+              <w:bottom w:w="30" w:type="dxa"/>
+              <w:left w:w="30" w:type="dxa"/>
+              <w:right w:w="30" w:type="dxa"/>
+            </w:tcMar>
             <w:shd w:fill="FFFFFF"/>
           </w:tcPr>
           <w:p>
@@ -3480,13 +4226,19 @@
         </w:tc>
         <w:tc>
           <w:tcPr>
-            <w:tcW w:type="dxa" w:w="1298"/>
+            <w:tcW w:type="dxa" w:w="1368"/>
             <w:tcBorders>
               <w:top w:val="single" w:sz="4" w:space="0" w:color="auto"/>
               <w:bottom w:val="single" w:sz="4" w:space="0" w:color="auto"/>
               <w:left w:val="single" w:sz="4" w:space="0" w:color="auto"/>
               <w:right w:val="single" w:sz="4" w:space="0" w:color="auto"/>
             </w:tcBorders>
+            <w:tcMar>
+              <w:top w:w="30" w:type="dxa"/>
+              <w:bottom w:w="30" w:type="dxa"/>
+              <w:left w:w="30" w:type="dxa"/>
+              <w:right w:w="30" w:type="dxa"/>
+            </w:tcMar>
             <w:shd w:fill="FFFFFF"/>
           </w:tcPr>
           <w:p>
@@ -3507,13 +4259,19 @@
         </w:tc>
         <w:tc>
           <w:tcPr>
-            <w:tcW w:type="dxa" w:w="1037"/>
+            <w:tcW w:type="dxa" w:w="1224"/>
             <w:tcBorders>
               <w:top w:val="single" w:sz="4" w:space="0" w:color="auto"/>
               <w:bottom w:val="single" w:sz="4" w:space="0" w:color="auto"/>
               <w:left w:val="single" w:sz="4" w:space="0" w:color="auto"/>
               <w:right w:val="single" w:sz="4" w:space="0" w:color="auto"/>
             </w:tcBorders>
+            <w:tcMar>
+              <w:top w:w="30" w:type="dxa"/>
+              <w:bottom w:w="30" w:type="dxa"/>
+              <w:left w:w="30" w:type="dxa"/>
+              <w:right w:w="30" w:type="dxa"/>
+            </w:tcMar>
             <w:shd w:fill="FFFFFF"/>
           </w:tcPr>
           <w:p>
@@ -3536,13 +4294,19 @@
         </w:tc>
         <w:tc>
           <w:tcPr>
-            <w:tcW w:type="dxa" w:w="608"/>
+            <w:tcW w:type="dxa" w:w="648"/>
             <w:tcBorders>
               <w:top w:val="single" w:sz="4" w:space="0" w:color="auto"/>
               <w:bottom w:val="single" w:sz="4" w:space="0" w:color="auto"/>
               <w:left w:val="single" w:sz="4" w:space="0" w:color="auto"/>
               <w:right w:val="single" w:sz="4" w:space="0" w:color="auto"/>
             </w:tcBorders>
+            <w:tcMar>
+              <w:top w:w="30" w:type="dxa"/>
+              <w:bottom w:w="30" w:type="dxa"/>
+              <w:left w:w="30" w:type="dxa"/>
+              <w:right w:w="30" w:type="dxa"/>
+            </w:tcMar>
             <w:shd w:fill="FFFFFF"/>
           </w:tcPr>
           <w:p>
@@ -3565,7 +4329,7 @@
       <w:tr>
         <w:tc>
           <w:tcPr>
-            <w:tcW w:type="dxa" w:w="9360"/>
+            <w:tcW w:type="dxa" w:w="10080"/>
             <w:gridSpan w:val="9"/>
             <w:shd w:fill="D9D9D9"/>
             <w:tcBorders>
@@ -3574,6 +4338,12 @@
               <w:left w:val="single" w:sz="4" w:space="0" w:color="auto"/>
               <w:right w:val="single" w:sz="4" w:space="0" w:color="auto"/>
             </w:tcBorders>
+            <w:tcMar>
+              <w:top w:w="30" w:type="dxa"/>
+              <w:bottom w:w="30" w:type="dxa"/>
+              <w:left w:w="30" w:type="dxa"/>
+              <w:right w:w="30" w:type="dxa"/>
+            </w:tcMar>
           </w:tcPr>
           <w:p>
             <w:pPr>
@@ -3595,13 +4365,19 @@
       <w:tr>
         <w:tc>
           <w:tcPr>
-            <w:tcW w:type="dxa" w:w="1602"/>
+            <w:tcW w:type="dxa" w:w="1656"/>
             <w:tcBorders>
               <w:top w:val="single" w:sz="4" w:space="0" w:color="auto"/>
               <w:bottom w:val="single" w:sz="4" w:space="0" w:color="auto"/>
               <w:left w:val="single" w:sz="4" w:space="0" w:color="auto"/>
               <w:right w:val="single" w:sz="4" w:space="0" w:color="auto"/>
             </w:tcBorders>
+            <w:tcMar>
+              <w:top w:w="30" w:type="dxa"/>
+              <w:bottom w:w="30" w:type="dxa"/>
+              <w:left w:w="30" w:type="dxa"/>
+              <w:right w:w="30" w:type="dxa"/>
+            </w:tcMar>
             <w:shd w:fill="FFFFFF"/>
           </w:tcPr>
           <w:p>
@@ -3622,13 +4398,19 @@
         </w:tc>
         <w:tc>
           <w:tcPr>
-            <w:tcW w:type="dxa" w:w="759"/>
+            <w:tcW w:type="dxa" w:w="936"/>
             <w:tcBorders>
               <w:top w:val="single" w:sz="4" w:space="0" w:color="auto"/>
               <w:bottom w:val="single" w:sz="4" w:space="0" w:color="auto"/>
               <w:left w:val="single" w:sz="4" w:space="0" w:color="auto"/>
               <w:right w:val="single" w:sz="4" w:space="0" w:color="auto"/>
             </w:tcBorders>
+            <w:tcMar>
+              <w:top w:w="30" w:type="dxa"/>
+              <w:bottom w:w="30" w:type="dxa"/>
+              <w:left w:w="30" w:type="dxa"/>
+              <w:right w:w="30" w:type="dxa"/>
+            </w:tcMar>
             <w:shd w:fill="FFFFFF"/>
           </w:tcPr>
           <w:p>
@@ -3649,13 +4431,19 @@
         </w:tc>
         <w:tc>
           <w:tcPr>
-            <w:tcW w:type="dxa" w:w="815"/>
+            <w:tcW w:type="dxa" w:w="936"/>
             <w:tcBorders>
               <w:top w:val="single" w:sz="4" w:space="0" w:color="auto"/>
               <w:bottom w:val="single" w:sz="4" w:space="0" w:color="auto"/>
               <w:left w:val="single" w:sz="4" w:space="0" w:color="auto"/>
               <w:right w:val="single" w:sz="4" w:space="0" w:color="auto"/>
             </w:tcBorders>
+            <w:tcMar>
+              <w:top w:w="30" w:type="dxa"/>
+              <w:bottom w:w="30" w:type="dxa"/>
+              <w:left w:w="30" w:type="dxa"/>
+              <w:right w:w="30" w:type="dxa"/>
+            </w:tcMar>
             <w:shd w:fill="FFFFFF"/>
           </w:tcPr>
           <w:p>
@@ -3676,13 +4464,19 @@
         </w:tc>
         <w:tc>
           <w:tcPr>
-            <w:tcW w:type="dxa" w:w="899"/>
+            <w:tcW w:type="dxa" w:w="864"/>
             <w:tcBorders>
               <w:top w:val="single" w:sz="4" w:space="0" w:color="auto"/>
               <w:bottom w:val="single" w:sz="4" w:space="0" w:color="auto"/>
               <w:left w:val="single" w:sz="4" w:space="0" w:color="auto"/>
               <w:right w:val="single" w:sz="4" w:space="0" w:color="auto"/>
             </w:tcBorders>
+            <w:tcMar>
+              <w:top w:w="30" w:type="dxa"/>
+              <w:bottom w:w="30" w:type="dxa"/>
+              <w:left w:w="30" w:type="dxa"/>
+              <w:right w:w="30" w:type="dxa"/>
+            </w:tcMar>
             <w:shd w:fill="FFFFFF"/>
           </w:tcPr>
           <w:p>
@@ -3703,13 +4497,19 @@
         </w:tc>
         <w:tc>
           <w:tcPr>
-            <w:tcW w:type="dxa" w:w="1096"/>
+            <w:tcW w:type="dxa" w:w="1152"/>
             <w:tcBorders>
               <w:top w:val="single" w:sz="4" w:space="0" w:color="auto"/>
               <w:bottom w:val="single" w:sz="4" w:space="0" w:color="auto"/>
               <w:left w:val="single" w:sz="4" w:space="0" w:color="auto"/>
               <w:right w:val="single" w:sz="4" w:space="0" w:color="auto"/>
             </w:tcBorders>
+            <w:tcMar>
+              <w:top w:w="30" w:type="dxa"/>
+              <w:bottom w:w="30" w:type="dxa"/>
+              <w:left w:w="30" w:type="dxa"/>
+              <w:right w:w="30" w:type="dxa"/>
+            </w:tcMar>
             <w:shd w:fill="FFFFFF"/>
           </w:tcPr>
           <w:p>
@@ -3730,13 +4530,19 @@
         </w:tc>
         <w:tc>
           <w:tcPr>
-            <w:tcW w:type="dxa" w:w="1349"/>
+            <w:tcW w:type="dxa" w:w="1296"/>
             <w:tcBorders>
               <w:top w:val="single" w:sz="4" w:space="0" w:color="auto"/>
               <w:bottom w:val="single" w:sz="4" w:space="0" w:color="auto"/>
               <w:left w:val="single" w:sz="4" w:space="0" w:color="auto"/>
               <w:right w:val="single" w:sz="4" w:space="0" w:color="auto"/>
             </w:tcBorders>
+            <w:tcMar>
+              <w:top w:w="30" w:type="dxa"/>
+              <w:bottom w:w="30" w:type="dxa"/>
+              <w:left w:w="30" w:type="dxa"/>
+              <w:right w:w="30" w:type="dxa"/>
+            </w:tcMar>
             <w:shd w:fill="FFFFFF"/>
           </w:tcPr>
           <w:p>
@@ -3757,13 +4563,19 @@
         </w:tc>
         <w:tc>
           <w:tcPr>
-            <w:tcW w:type="dxa" w:w="1298"/>
+            <w:tcW w:type="dxa" w:w="1368"/>
             <w:tcBorders>
               <w:top w:val="single" w:sz="4" w:space="0" w:color="auto"/>
               <w:bottom w:val="single" w:sz="4" w:space="0" w:color="auto"/>
               <w:left w:val="single" w:sz="4" w:space="0" w:color="auto"/>
               <w:right w:val="single" w:sz="4" w:space="0" w:color="auto"/>
             </w:tcBorders>
+            <w:tcMar>
+              <w:top w:w="30" w:type="dxa"/>
+              <w:bottom w:w="30" w:type="dxa"/>
+              <w:left w:w="30" w:type="dxa"/>
+              <w:right w:w="30" w:type="dxa"/>
+            </w:tcMar>
             <w:shd w:fill="FFFFFF"/>
           </w:tcPr>
           <w:p>
@@ -3784,13 +4596,19 @@
         </w:tc>
         <w:tc>
           <w:tcPr>
-            <w:tcW w:type="dxa" w:w="1037"/>
+            <w:tcW w:type="dxa" w:w="1224"/>
             <w:tcBorders>
               <w:top w:val="single" w:sz="4" w:space="0" w:color="auto"/>
               <w:bottom w:val="single" w:sz="4" w:space="0" w:color="auto"/>
               <w:left w:val="single" w:sz="4" w:space="0" w:color="auto"/>
               <w:right w:val="single" w:sz="4" w:space="0" w:color="auto"/>
             </w:tcBorders>
+            <w:tcMar>
+              <w:top w:w="30" w:type="dxa"/>
+              <w:bottom w:w="30" w:type="dxa"/>
+              <w:left w:w="30" w:type="dxa"/>
+              <w:right w:w="30" w:type="dxa"/>
+            </w:tcMar>
             <w:shd w:fill="FFFFFF"/>
           </w:tcPr>
           <w:p>
@@ -3811,13 +4629,19 @@
         </w:tc>
         <w:tc>
           <w:tcPr>
-            <w:tcW w:type="dxa" w:w="608"/>
+            <w:tcW w:type="dxa" w:w="648"/>
             <w:tcBorders>
               <w:top w:val="single" w:sz="4" w:space="0" w:color="auto"/>
               <w:bottom w:val="single" w:sz="4" w:space="0" w:color="auto"/>
               <w:left w:val="single" w:sz="4" w:space="0" w:color="auto"/>
               <w:right w:val="single" w:sz="4" w:space="0" w:color="auto"/>
             </w:tcBorders>
+            <w:tcMar>
+              <w:top w:w="30" w:type="dxa"/>
+              <w:bottom w:w="30" w:type="dxa"/>
+              <w:left w:w="30" w:type="dxa"/>
+              <w:right w:w="30" w:type="dxa"/>
+            </w:tcMar>
             <w:shd w:fill="FFFFFF"/>
           </w:tcPr>
           <w:p>
@@ -3840,13 +4664,19 @@
       <w:tr>
         <w:tc>
           <w:tcPr>
-            <w:tcW w:type="dxa" w:w="1602"/>
+            <w:tcW w:type="dxa" w:w="1656"/>
             <w:tcBorders>
               <w:top w:val="single" w:sz="4" w:space="0" w:color="auto"/>
               <w:bottom w:val="single" w:sz="4" w:space="0" w:color="auto"/>
               <w:left w:val="single" w:sz="4" w:space="0" w:color="auto"/>
               <w:right w:val="single" w:sz="4" w:space="0" w:color="auto"/>
             </w:tcBorders>
+            <w:tcMar>
+              <w:top w:w="30" w:type="dxa"/>
+              <w:bottom w:w="30" w:type="dxa"/>
+              <w:left w:w="30" w:type="dxa"/>
+              <w:right w:w="30" w:type="dxa"/>
+            </w:tcMar>
             <w:shd w:fill="FFFFFF"/>
           </w:tcPr>
           <w:p>
@@ -3867,13 +4697,19 @@
         </w:tc>
         <w:tc>
           <w:tcPr>
-            <w:tcW w:type="dxa" w:w="759"/>
+            <w:tcW w:type="dxa" w:w="936"/>
             <w:tcBorders>
               <w:top w:val="single" w:sz="4" w:space="0" w:color="auto"/>
               <w:bottom w:val="single" w:sz="4" w:space="0" w:color="auto"/>
               <w:left w:val="single" w:sz="4" w:space="0" w:color="auto"/>
               <w:right w:val="single" w:sz="4" w:space="0" w:color="auto"/>
             </w:tcBorders>
+            <w:tcMar>
+              <w:top w:w="30" w:type="dxa"/>
+              <w:bottom w:w="30" w:type="dxa"/>
+              <w:left w:w="30" w:type="dxa"/>
+              <w:right w:w="30" w:type="dxa"/>
+            </w:tcMar>
             <w:shd w:fill="FFFFFF"/>
           </w:tcPr>
           <w:p>
@@ -3894,13 +4730,19 @@
         </w:tc>
         <w:tc>
           <w:tcPr>
-            <w:tcW w:type="dxa" w:w="815"/>
+            <w:tcW w:type="dxa" w:w="936"/>
             <w:tcBorders>
               <w:top w:val="single" w:sz="4" w:space="0" w:color="auto"/>
               <w:bottom w:val="single" w:sz="4" w:space="0" w:color="auto"/>
               <w:left w:val="single" w:sz="4" w:space="0" w:color="auto"/>
               <w:right w:val="single" w:sz="4" w:space="0" w:color="auto"/>
             </w:tcBorders>
+            <w:tcMar>
+              <w:top w:w="30" w:type="dxa"/>
+              <w:bottom w:w="30" w:type="dxa"/>
+              <w:left w:w="30" w:type="dxa"/>
+              <w:right w:w="30" w:type="dxa"/>
+            </w:tcMar>
             <w:shd w:fill="FFFFFF"/>
           </w:tcPr>
           <w:p>
@@ -3921,13 +4763,19 @@
         </w:tc>
         <w:tc>
           <w:tcPr>
-            <w:tcW w:type="dxa" w:w="899"/>
+            <w:tcW w:type="dxa" w:w="864"/>
             <w:tcBorders>
               <w:top w:val="single" w:sz="4" w:space="0" w:color="auto"/>
               <w:bottom w:val="single" w:sz="4" w:space="0" w:color="auto"/>
               <w:left w:val="single" w:sz="4" w:space="0" w:color="auto"/>
               <w:right w:val="single" w:sz="4" w:space="0" w:color="auto"/>
             </w:tcBorders>
+            <w:tcMar>
+              <w:top w:w="30" w:type="dxa"/>
+              <w:bottom w:w="30" w:type="dxa"/>
+              <w:left w:w="30" w:type="dxa"/>
+              <w:right w:w="30" w:type="dxa"/>
+            </w:tcMar>
             <w:shd w:fill="FFFFFF"/>
           </w:tcPr>
           <w:p>
@@ -3948,13 +4796,19 @@
         </w:tc>
         <w:tc>
           <w:tcPr>
-            <w:tcW w:type="dxa" w:w="1096"/>
+            <w:tcW w:type="dxa" w:w="1152"/>
             <w:tcBorders>
               <w:top w:val="single" w:sz="4" w:space="0" w:color="auto"/>
               <w:bottom w:val="single" w:sz="4" w:space="0" w:color="auto"/>
               <w:left w:val="single" w:sz="4" w:space="0" w:color="auto"/>
               <w:right w:val="single" w:sz="4" w:space="0" w:color="auto"/>
             </w:tcBorders>
+            <w:tcMar>
+              <w:top w:w="30" w:type="dxa"/>
+              <w:bottom w:w="30" w:type="dxa"/>
+              <w:left w:w="30" w:type="dxa"/>
+              <w:right w:w="30" w:type="dxa"/>
+            </w:tcMar>
             <w:shd w:fill="FFFFFF"/>
           </w:tcPr>
           <w:p>
@@ -3975,13 +4829,19 @@
         </w:tc>
         <w:tc>
           <w:tcPr>
-            <w:tcW w:type="dxa" w:w="1349"/>
+            <w:tcW w:type="dxa" w:w="1296"/>
             <w:tcBorders>
               <w:top w:val="single" w:sz="4" w:space="0" w:color="auto"/>
               <w:bottom w:val="single" w:sz="4" w:space="0" w:color="auto"/>
               <w:left w:val="single" w:sz="4" w:space="0" w:color="auto"/>
               <w:right w:val="single" w:sz="4" w:space="0" w:color="auto"/>
             </w:tcBorders>
+            <w:tcMar>
+              <w:top w:w="30" w:type="dxa"/>
+              <w:bottom w:w="30" w:type="dxa"/>
+              <w:left w:w="30" w:type="dxa"/>
+              <w:right w:w="30" w:type="dxa"/>
+            </w:tcMar>
             <w:shd w:fill="FFFFFF"/>
           </w:tcPr>
           <w:p>
@@ -4002,13 +4862,19 @@
         </w:tc>
         <w:tc>
           <w:tcPr>
-            <w:tcW w:type="dxa" w:w="1298"/>
+            <w:tcW w:type="dxa" w:w="1368"/>
             <w:tcBorders>
               <w:top w:val="single" w:sz="4" w:space="0" w:color="auto"/>
               <w:bottom w:val="single" w:sz="4" w:space="0" w:color="auto"/>
               <w:left w:val="single" w:sz="4" w:space="0" w:color="auto"/>
               <w:right w:val="single" w:sz="4" w:space="0" w:color="auto"/>
             </w:tcBorders>
+            <w:tcMar>
+              <w:top w:w="30" w:type="dxa"/>
+              <w:bottom w:w="30" w:type="dxa"/>
+              <w:left w:w="30" w:type="dxa"/>
+              <w:right w:w="30" w:type="dxa"/>
+            </w:tcMar>
             <w:shd w:fill="FFFFFF"/>
           </w:tcPr>
           <w:p>
@@ -4029,13 +4895,19 @@
         </w:tc>
         <w:tc>
           <w:tcPr>
-            <w:tcW w:type="dxa" w:w="1037"/>
+            <w:tcW w:type="dxa" w:w="1224"/>
             <w:tcBorders>
               <w:top w:val="single" w:sz="4" w:space="0" w:color="auto"/>
               <w:bottom w:val="single" w:sz="4" w:space="0" w:color="auto"/>
               <w:left w:val="single" w:sz="4" w:space="0" w:color="auto"/>
               <w:right w:val="single" w:sz="4" w:space="0" w:color="auto"/>
             </w:tcBorders>
+            <w:tcMar>
+              <w:top w:w="30" w:type="dxa"/>
+              <w:bottom w:w="30" w:type="dxa"/>
+              <w:left w:w="30" w:type="dxa"/>
+              <w:right w:w="30" w:type="dxa"/>
+            </w:tcMar>
             <w:shd w:fill="FFFFFF"/>
           </w:tcPr>
           <w:p>
@@ -4056,13 +4928,19 @@
         </w:tc>
         <w:tc>
           <w:tcPr>
-            <w:tcW w:type="dxa" w:w="608"/>
+            <w:tcW w:type="dxa" w:w="648"/>
             <w:tcBorders>
               <w:top w:val="single" w:sz="4" w:space="0" w:color="auto"/>
               <w:bottom w:val="single" w:sz="4" w:space="0" w:color="auto"/>
               <w:left w:val="single" w:sz="4" w:space="0" w:color="auto"/>
               <w:right w:val="single" w:sz="4" w:space="0" w:color="auto"/>
             </w:tcBorders>
+            <w:tcMar>
+              <w:top w:w="30" w:type="dxa"/>
+              <w:bottom w:w="30" w:type="dxa"/>
+              <w:left w:w="30" w:type="dxa"/>
+              <w:right w:w="30" w:type="dxa"/>
+            </w:tcMar>
             <w:shd w:fill="FFFFFF"/>
           </w:tcPr>
           <w:p>
@@ -4085,7 +4963,7 @@
     </w:tbl>
     <w:sectPr>
       <w:pgSz w:w="12240" w:h="15840"/>
-      <w:pgMar w:top="1440" w:right="1440" w:bottom="1440" w:left="1440" w:header="720" w:footer="720" w:gutter="0"/>
+      <w:pgMar w:top="1152" w:right="1080" w:bottom="1152" w:left="1080" w:header="720" w:footer="720" w:gutter="0"/>
       <w:cols w:space="720"/>
       <w:docGrid w:linePitch="360"/>
     </w:sectPr>

</xml_diff>